<commit_message>
Checkpoint: finalize conference deliverables (Русский инженер + ИИАСУ)
Thesis and article updated with co-author (Колосов М.И.), reference list
fixes, and page-length trims to meet the thesis format's 2-page limit.
Removed the old presentation - it's tied to a superseded title and will be
rebuilt from scratch for the actual conference submissions. Gitignored
docs/Заявки и заключения/ (personal expert-review paperwork with real
signature/clearance data - not meant for a public repo). Cleaned up stray
files picked up while probing for a way to verify page counts locally.

This is the reference point for the conference track before starting
Ledentsov Prize business-pitch work in a separate ledentsov/ folder.
</commit_message>
<xml_diff>
--- a/docs/Статья ИИАСУ Синявский СД.docx
+++ b/docs/Статья ИИАСУ Синявский СД.docx
@@ -5,57 +5,48 @@
     <w:p>
       <w:pPr>
         <w:spacing w:after="240" w:line="360" w:lineRule="auto"/>
-        <w:rPr>
-          <w:rFonts w:ascii="Times New Roman" w:hAnsi="Times New Roman" w:cs="Times New Roman"/>
-        </w:rPr>
-      </w:pPr>
-      <w:r>
-        <w:rPr>
-          <w:rFonts w:ascii="Times New Roman" w:hAnsi="Times New Roman" w:cs="Times New Roman"/>
-          <w:sz w:val="24"/>
-          <w:szCs w:val="24"/>
-        </w:rPr>
-        <w:t xml:space="preserve">УДК 004.75:004.032.26</w:t>
+      </w:pPr>
+      <w:r>
+        <w:rPr>
+          <w:sz w:val="24"/>
+          <w:szCs w:val="24"/>
+        </w:rPr>
+        <w:t>УДК 004.75:004.032.26</w:t>
       </w:r>
     </w:p>
     <w:p>
       <w:pPr>
         <w:spacing w:before="240" w:after="360" w:line="360" w:lineRule="auto"/>
-        <w:rPr>
-          <w:rFonts w:ascii="Times New Roman" w:hAnsi="Times New Roman" w:cs="Times New Roman"/>
-        </w:rPr>
-      </w:pPr>
-      <w:r>
-        <w:rPr>
-          <w:rFonts w:ascii="Times New Roman" w:hAnsi="Times New Roman" w:cs="Times New Roman"/>
+      </w:pPr>
+      <w:r>
+        <w:rPr>
           <w:b/>
           <w:bCs/>
           <w:sz w:val="24"/>
           <w:szCs w:val="24"/>
         </w:rPr>
-        <w:t xml:space="preserve">Адаптивная маршрутизация запросов между синхронным и асинхронным веб-движками на основе классификатора нагрузки: оценка практической целесообразности</w:t>
-      </w:r>
-    </w:p>
-    <w:p>
-      <w:pPr>
-        <w:spacing w:after="0" w:line="360" w:lineRule="auto"/>
-        <w:rPr>
-          <w:rFonts w:ascii="Times New Roman" w:hAnsi="Times New Roman" w:cs="Times New Roman"/>
-        </w:rPr>
-      </w:pPr>
-      <w:r>
-        <w:rPr>
-          <w:rFonts w:ascii="Times New Roman" w:hAnsi="Times New Roman" w:cs="Times New Roman"/>
+        <w:t>Адаптивная маршрутизация запросов между синхронным и асинхронным веб-движками на основе классификатора нагрузки: оценка практической целесообразности</w:t>
+      </w:r>
+    </w:p>
+    <w:p>
+      <w:pPr>
+        <w:spacing w:line="360" w:lineRule="auto"/>
+        <w:rPr>
+          <w:sz w:val="24"/>
+          <w:szCs w:val="24"/>
+        </w:rPr>
+      </w:pPr>
+      <w:r>
+        <w:rPr>
           <w:b/>
           <w:bCs/>
           <w:sz w:val="24"/>
           <w:szCs w:val="24"/>
         </w:rPr>
-        <w:t xml:space="preserve">Синявский Станислав Дмитриевич</w:t>
-      </w:r>
-      <w:r>
-        <w:rPr>
-          <w:rFonts w:ascii="Times New Roman" w:hAnsi="Times New Roman" w:cs="Times New Roman"/>
+        <w:t>Синявский Станислав Дмитриевич</w:t>
+      </w:r>
+      <w:r>
+        <w:rPr>
           <w:sz w:val="24"/>
           <w:szCs w:val="24"/>
         </w:rPr>
@@ -63,7 +54,6 @@
       </w:r>
       <w:r>
         <w:rPr>
-          <w:rFonts w:ascii="Times New Roman" w:hAnsi="Times New Roman" w:cs="Times New Roman"/>
           <w:sz w:val="24"/>
           <w:szCs w:val="24"/>
         </w:rPr>
@@ -71,174 +61,288 @@
       </w:r>
       <w:r>
         <w:rPr>
-          <w:rFonts w:ascii="Times New Roman" w:hAnsi="Times New Roman" w:cs="Times New Roman"/>
-          <w:sz w:val="24"/>
-          <w:szCs w:val="24"/>
-        </w:rPr>
-        <w:t xml:space="preserve">ssd-tula@mail.ru</w:t>
+          <w:color w:val="0086BF"/>
+          <w:sz w:val="24"/>
+          <w:szCs w:val="24"/>
+          <w:shd w:val="clear" w:color="auto" w:fill="FFFFFF"/>
+          <w:lang w:val="en-US"/>
+        </w:rPr>
+        <w:t>ssd</w:t>
+      </w:r>
+      <w:r>
+        <w:rPr>
+          <w:color w:val="0086BF"/>
+          <w:sz w:val="24"/>
+          <w:szCs w:val="24"/>
+          <w:shd w:val="clear" w:color="auto" w:fill="FFFFFF"/>
+        </w:rPr>
+        <w:t>-</w:t>
+      </w:r>
+      <w:r>
+        <w:rPr>
+          <w:color w:val="0086BF"/>
+          <w:sz w:val="24"/>
+          <w:szCs w:val="24"/>
+          <w:shd w:val="clear" w:color="auto" w:fill="FFFFFF"/>
+          <w:lang w:val="en-US"/>
+        </w:rPr>
+        <w:t>tula</w:t>
+      </w:r>
+      <w:r>
+        <w:rPr>
+          <w:color w:val="0086BF"/>
+          <w:sz w:val="24"/>
+          <w:szCs w:val="24"/>
+          <w:shd w:val="clear" w:color="auto" w:fill="FFFFFF"/>
+        </w:rPr>
+        <w:t>@</w:t>
+      </w:r>
+      <w:r>
+        <w:rPr>
+          <w:color w:val="0086BF"/>
+          <w:sz w:val="24"/>
+          <w:szCs w:val="24"/>
+          <w:shd w:val="clear" w:color="auto" w:fill="FFFFFF"/>
+          <w:lang w:val="en-US"/>
+        </w:rPr>
+        <w:t>mail</w:t>
+      </w:r>
+      <w:r>
+        <w:rPr>
+          <w:color w:val="0086BF"/>
+          <w:sz w:val="24"/>
+          <w:szCs w:val="24"/>
+          <w:shd w:val="clear" w:color="auto" w:fill="FFFFFF"/>
+        </w:rPr>
+        <w:t>.</w:t>
+      </w:r>
+      <w:r>
+        <w:rPr>
+          <w:color w:val="0086BF"/>
+          <w:sz w:val="24"/>
+          <w:szCs w:val="24"/>
+          <w:shd w:val="clear" w:color="auto" w:fill="FFFFFF"/>
+          <w:lang w:val="en-US"/>
+        </w:rPr>
+        <w:t>ru</w:t>
       </w:r>
     </w:p>
     <w:p>
       <w:pPr>
         <w:spacing w:line="360" w:lineRule="auto"/>
         <w:rPr>
-          <w:rFonts w:ascii="Times New Roman" w:hAnsi="Times New Roman" w:cs="Times New Roman"/>
-        </w:rPr>
-      </w:pPr>
-      <w:r>
-        <w:rPr>
-          <w:rFonts w:ascii="Times New Roman" w:hAnsi="Times New Roman" w:cs="Times New Roman"/>
-          <w:sz w:val="24"/>
-          <w:szCs w:val="24"/>
-        </w:rPr>
-        <w:t xml:space="preserve">МГТУ им. Н.Э. Баумана, Москва, Россия</w:t>
+          <w:sz w:val="24"/>
+          <w:szCs w:val="24"/>
+        </w:rPr>
+      </w:pPr>
+    </w:p>
+    <w:p>
+      <w:pPr>
+        <w:spacing w:line="360" w:lineRule="auto"/>
+      </w:pPr>
+      <w:r>
+        <w:rPr>
+          <w:sz w:val="24"/>
+          <w:szCs w:val="24"/>
+        </w:rPr>
+        <w:t>МГТУ им. Н.Э. Баумана, Москва, Россия</w:t>
       </w:r>
     </w:p>
     <w:p>
       <w:pPr>
         <w:spacing w:before="240" w:line="360" w:lineRule="auto"/>
         <w:jc w:val="both"/>
-        <w:rPr>
-          <w:rFonts w:ascii="Times New Roman" w:hAnsi="Times New Roman" w:cs="Times New Roman"/>
-        </w:rPr>
-      </w:pPr>
-      <w:r>
-        <w:rPr>
-          <w:rFonts w:ascii="Times New Roman" w:hAnsi="Times New Roman" w:cs="Times New Roman"/>
+      </w:pPr>
+      <w:r>
+        <w:rPr>
           <w:b/>
           <w:bCs/>
           <w:sz w:val="24"/>
           <w:szCs w:val="24"/>
         </w:rPr>
+        <w:t xml:space="preserve">Аннотация. </w:t>
+      </w:r>
+      <w:r>
+        <w:rPr>
+          <w:sz w:val="24"/>
+          <w:szCs w:val="24"/>
+        </w:rPr>
+        <w:t>Рассмотрена задача выбора между синхронным и асинхронным веб-движками при разнородном по типу нагрузки потоке запросов. Предложена адаптивная маршрутизация запросов на основе обученного классификатора, направляющая каждый запрос на движок, физически лучше подходящий для его типа (I/O-bound или CPU-bound). Экспериментально показано, что при однородной нагрузке выигрыша нет, а при гетерогенном потоке адаптивная маршрутизация повышает пропускную способность на 39–87% и снижает среднюю задержку в 1,8–2,4 раза относительно лучшего одиночного движка. Локализован физический механизм эффекта и сформулирован практический критерий целесообразности применения подобной архитектуры.</w:t>
+      </w:r>
+    </w:p>
+    <w:p>
+      <w:pPr>
+        <w:spacing w:before="240" w:line="360" w:lineRule="auto"/>
+        <w:jc w:val="both"/>
+      </w:pPr>
+      <w:r>
+        <w:rPr>
+          <w:b/>
+          <w:bCs/>
+          <w:sz w:val="24"/>
+          <w:szCs w:val="24"/>
+        </w:rPr>
+        <w:t xml:space="preserve">Ключевые слова: </w:t>
+      </w:r>
+      <w:r>
+        <w:rPr>
+          <w:sz w:val="24"/>
+          <w:szCs w:val="24"/>
+        </w:rPr>
+        <w:t>адаптивная маршрутизация, классификация нагрузки, нейронные сети, синхронные серверы, асинхронные серверы, пропускная способность</w:t>
+      </w:r>
+    </w:p>
+    <w:p>
+      <w:pPr>
+        <w:spacing w:before="240" w:line="360" w:lineRule="auto"/>
+        <w:jc w:val="both"/>
+      </w:pPr>
+      <w:r>
+        <w:rPr>
+          <w:b/>
+          <w:bCs/>
+          <w:sz w:val="24"/>
+          <w:szCs w:val="24"/>
+        </w:rPr>
         <w:t xml:space="preserve">Введение. </w:t>
       </w:r>
       <w:r>
         <w:rPr>
-          <w:rFonts w:ascii="Times New Roman" w:hAnsi="Times New Roman" w:cs="Times New Roman"/>
-          <w:sz w:val="24"/>
-          <w:szCs w:val="24"/>
-        </w:rPr>
-        <w:t xml:space="preserve">Современные веб-приложения обрабатывают запросы существенно разного профиля: часть операций носит преимущественно вычислительный (CPU-bound) характер, другие интенсивно используют ввод-вывод (I/O-bound) — обращения к базам данных, внешним API, файловой системе. На практике команда разработки обычно ограничивается выбором одного движка на всё приложение целиком, что является субоптимальным решением при разнородном входящем потоке; в промышленных распределённых системах для решения аналогичной проблемы применяются адаптивные алгоритмы балансировки нагрузки [1, 2]. Синхронные программные каркасы, например Flask, обрабатывают каждый запрос в отдельном потоке операционной системы [3]; асинхронные решения, например FastAPI, эффективно распоряжаются ресурсами CPU в условиях длительного ожидания ввода-вывода за счёт однопоточного event loop [4], но чувствительны к попаданию в этот event loop CPU-интенсивных задач, блокирующих обработку всех остальных конкурентных запросов [5].</w:t>
-      </w:r>
-    </w:p>
-    <w:p>
-      <w:pPr>
-        <w:spacing w:after="0" w:line="360" w:lineRule="auto"/>
+          <w:sz w:val="24"/>
+          <w:szCs w:val="24"/>
+        </w:rPr>
+        <w:t>Современные веб-приложения обрабатывают запросы существенно разного профиля: часть операций носит преимущественно вычислительный (CPU-bound) характер, другие интенсивно используют ввод-вывод (I/O-bound) — обращения к базам данных, внешним API, файловой системе. На практике команда разработки обычно ограничивается выбором одного движка на всё приложение целиком, что является субоптимальным решением при разнородном входящем потоке; в промышленных распределённых системах для решения аналогичной проблемы применяются адаптивные алгоритмы балансировки нагрузки [1, 2]. Синхронные программные каркасы, например Flask, обрабатывают каждый запрос в отдельном потоке операционной системы [3]; асинхронные решения, например FastAPI, эффективно распоряжаются ресурсами CPU в условиях длительного ожидания ввода-вывода за счёт однопоточного event loop [4], но чувствительны к попаданию в этот event loop CPU-интенсивных задач, блокирующих обработку всех остальных конкурентных запросов [5].</w:t>
+      </w:r>
+    </w:p>
+    <w:p>
+      <w:pPr>
+        <w:spacing w:line="360" w:lineRule="auto"/>
         <w:ind w:firstLine="709"/>
         <w:jc w:val="both"/>
-        <w:rPr>
-          <w:rFonts w:ascii="Times New Roman" w:hAnsi="Times New Roman" w:cs="Times New Roman"/>
-        </w:rPr>
-      </w:pPr>
-      <w:r>
-        <w:rPr>
-          <w:rFonts w:ascii="Times New Roman" w:hAnsi="Times New Roman" w:cs="Times New Roman"/>
-          <w:sz w:val="24"/>
-          <w:szCs w:val="24"/>
-        </w:rPr>
-        <w:t xml:space="preserve">Цель настоящего исследования — оценка практической целесообразности адаптивной маршрутизации HTTP-запросов между синхронным и асинхронным веб-движками на основе обученного классификатора нагрузки. Для достижения цели решались следующие задачи:</w:t>
-      </w:r>
-    </w:p>
-    <w:p>
-      <w:pPr>
-        <w:numPr>
-          <w:ilvl w:val="0"/>
-          <w:numId w:val="1"/>
-        </w:numPr>
+      </w:pPr>
+      <w:r>
+        <w:rPr>
+          <w:b/>
+          <w:bCs/>
+          <w:sz w:val="24"/>
+          <w:szCs w:val="24"/>
+        </w:rPr>
+        <w:t>Цель</w:t>
+      </w:r>
+      <w:r>
+        <w:rPr>
+          <w:sz w:val="24"/>
+          <w:szCs w:val="24"/>
+        </w:rPr>
+        <w:t xml:space="preserve"> настоящего исследования — оценка практической целесообразности адаптивной маршрутизации HTTP-запросов между синхронным и асинхронным веб-движками на основе обученного классификатора нагрузки. Для достижения цели решались следующие задачи:</w:t>
+      </w:r>
+    </w:p>
+    <w:p>
+      <w:pPr>
         <w:spacing w:after="60" w:line="360" w:lineRule="auto"/>
+        <w:ind w:left="360"/>
         <w:jc w:val="both"/>
-        <w:rPr>
-          <w:rFonts w:ascii="Times New Roman" w:hAnsi="Times New Roman" w:cs="Times New Roman"/>
-        </w:rPr>
-      </w:pPr>
-      <w:r>
-        <w:rPr>
-          <w:rFonts w:ascii="Times New Roman" w:hAnsi="Times New Roman" w:cs="Times New Roman"/>
-          <w:sz w:val="24"/>
-          <w:szCs w:val="24"/>
-        </w:rPr>
-        <w:t xml:space="preserve">реализовать экспериментальный шлюз, принимающий решение о маршрутизации каждого запроса на основе признаков нагрузки;</w:t>
-      </w:r>
-    </w:p>
-    <w:p>
-      <w:pPr>
-        <w:numPr>
-          <w:ilvl w:val="0"/>
-          <w:numId w:val="1"/>
-        </w:numPr>
+      </w:pPr>
+      <w:r>
+        <w:rPr>
+          <w:sz w:val="24"/>
+          <w:szCs w:val="24"/>
+        </w:rPr>
+        <w:lastRenderedPageBreak/>
+        <w:t xml:space="preserve">- </w:t>
+      </w:r>
+      <w:r>
+        <w:rPr>
+          <w:sz w:val="24"/>
+          <w:szCs w:val="24"/>
+        </w:rPr>
+        <w:t>реализовать экспериментальный шлюз, принимающий решение о маршрутизации каждого запроса на основе признаков нагрузки;</w:t>
+      </w:r>
+    </w:p>
+    <w:p>
+      <w:pPr>
         <w:spacing w:after="60" w:line="360" w:lineRule="auto"/>
+        <w:ind w:left="360"/>
         <w:jc w:val="both"/>
-        <w:rPr>
-          <w:rFonts w:ascii="Times New Roman" w:hAnsi="Times New Roman" w:cs="Times New Roman"/>
-        </w:rPr>
-      </w:pPr>
-      <w:r>
-        <w:rPr>
-          <w:rFonts w:ascii="Times New Roman" w:hAnsi="Times New Roman" w:cs="Times New Roman"/>
-          <w:sz w:val="24"/>
-          <w:szCs w:val="24"/>
-        </w:rPr>
-        <w:t xml:space="preserve">обучить нейросетевой классификатор, предсказывающий движок, оптимальный для конкретного запроса;</w:t>
-      </w:r>
-    </w:p>
-    <w:p>
-      <w:pPr>
-        <w:numPr>
-          <w:ilvl w:val="0"/>
-          <w:numId w:val="1"/>
-        </w:numPr>
+      </w:pPr>
+      <w:r>
+        <w:rPr>
+          <w:sz w:val="24"/>
+          <w:szCs w:val="24"/>
+        </w:rPr>
+        <w:t xml:space="preserve">- </w:t>
+      </w:r>
+      <w:r>
+        <w:rPr>
+          <w:sz w:val="24"/>
+          <w:szCs w:val="24"/>
+        </w:rPr>
+        <w:t>обучить нейросетевой классификатор, предсказывающий движок, оптимальный для конкретного запроса;</w:t>
+      </w:r>
+    </w:p>
+    <w:p>
+      <w:pPr>
         <w:spacing w:after="60" w:line="360" w:lineRule="auto"/>
+        <w:ind w:left="360"/>
         <w:jc w:val="both"/>
-        <w:rPr>
-          <w:rFonts w:ascii="Times New Roman" w:hAnsi="Times New Roman" w:cs="Times New Roman"/>
-        </w:rPr>
-      </w:pPr>
-      <w:r>
-        <w:rPr>
-          <w:rFonts w:ascii="Times New Roman" w:hAnsi="Times New Roman" w:cs="Times New Roman"/>
-          <w:sz w:val="24"/>
-          <w:szCs w:val="24"/>
-        </w:rPr>
-        <w:t xml:space="preserve">экспериментально проверить гипотезу о приросте пропускной способности и снижении задержки при адаптивной маршрутизации;</w:t>
-      </w:r>
-    </w:p>
-    <w:p>
-      <w:pPr>
-        <w:numPr>
-          <w:ilvl w:val="0"/>
-          <w:numId w:val="1"/>
-        </w:numPr>
+      </w:pPr>
+      <w:r>
+        <w:rPr>
+          <w:sz w:val="24"/>
+          <w:szCs w:val="24"/>
+        </w:rPr>
+        <w:t xml:space="preserve">- </w:t>
+      </w:r>
+      <w:r>
+        <w:rPr>
+          <w:sz w:val="24"/>
+          <w:szCs w:val="24"/>
+        </w:rPr>
+        <w:t>экспериментально проверить гипотезу о приросте пропускной способности и снижении задержки при адаптивной маршрутизации;</w:t>
+      </w:r>
+    </w:p>
+    <w:p>
+      <w:pPr>
         <w:spacing w:after="60" w:line="360" w:lineRule="auto"/>
+        <w:ind w:left="360"/>
         <w:jc w:val="both"/>
-        <w:rPr>
-          <w:rFonts w:ascii="Times New Roman" w:hAnsi="Times New Roman" w:cs="Times New Roman"/>
-        </w:rPr>
-      </w:pPr>
-      <w:r>
-        <w:rPr>
-          <w:rFonts w:ascii="Times New Roman" w:hAnsi="Times New Roman" w:cs="Times New Roman"/>
-          <w:sz w:val="24"/>
-          <w:szCs w:val="24"/>
-        </w:rPr>
-        <w:t xml:space="preserve">локализовать физический механизм наблюдаемого эффекта.</w:t>
-      </w:r>
-    </w:p>
-    <w:p>
-      <w:pPr>
-        <w:spacing w:after="0" w:line="360" w:lineRule="auto"/>
+      </w:pPr>
+      <w:r>
+        <w:rPr>
+          <w:sz w:val="24"/>
+          <w:szCs w:val="24"/>
+        </w:rPr>
+        <w:t xml:space="preserve">- </w:t>
+      </w:r>
+      <w:r>
+        <w:rPr>
+          <w:sz w:val="24"/>
+          <w:szCs w:val="24"/>
+        </w:rPr>
+        <w:t>локализовать физический механизм наблюдаемого эффекта.</w:t>
+      </w:r>
+    </w:p>
+    <w:p>
+      <w:pPr>
+        <w:spacing w:line="360" w:lineRule="auto"/>
         <w:ind w:firstLine="709"/>
         <w:jc w:val="both"/>
-        <w:rPr>
-          <w:rFonts w:ascii="Times New Roman" w:hAnsi="Times New Roman" w:cs="Times New Roman"/>
-        </w:rPr>
-      </w:pPr>
-      <w:r>
-        <w:rPr>
-          <w:rFonts w:ascii="Times New Roman" w:hAnsi="Times New Roman" w:cs="Times New Roman"/>
-          <w:sz w:val="24"/>
-          <w:szCs w:val="24"/>
-        </w:rPr>
-        <w:t xml:space="preserve">Гипотеза исследования: адаптивная маршрутизация запросов, основанная на обученном классификаторе, обеспечивает прирост пропускной способности не менее чем на 25% и снижение задержки в 1,8–2,2 раза относительно любого одиночного движка при конкурентной нагрузке от 10 до 200 запросов в секунду — при условии, что входящий поток гетерогенен по типу запросов, поскольку на однородном потоке движки обрабатывают любой запрос одинаково быстро и выигрыш невозможен в принципе.</w:t>
+      </w:pPr>
+      <w:r>
+        <w:rPr>
+          <w:b/>
+          <w:bCs/>
+          <w:sz w:val="24"/>
+          <w:szCs w:val="24"/>
+        </w:rPr>
+        <w:t>Гипотеза</w:t>
+      </w:r>
+      <w:r>
+        <w:rPr>
+          <w:sz w:val="24"/>
+          <w:szCs w:val="24"/>
+        </w:rPr>
+        <w:t xml:space="preserve"> исследования: адаптивная маршрутизация запросов, основанная на обученном классификаторе, обеспечивает прирост пропускной способности не менее чем на 25% и снижение задержки в 1,8–2,2 раза относительно любого одиночного движка при конкурентной нагрузке от 10 до 200 запросов в секунду — при условии, что входящий поток гетерогенен по типу запросов, поскольку на однородном потоке движки обрабатывают любой запрос одинаково быстро и выигрыш невозможен в принципе.</w:t>
       </w:r>
     </w:p>
     <w:p>
@@ -246,13 +350,9 @@
         <w:spacing w:before="240" w:line="360" w:lineRule="auto"/>
         <w:ind w:firstLine="709"/>
         <w:jc w:val="both"/>
-        <w:rPr>
-          <w:rFonts w:ascii="Times New Roman" w:hAnsi="Times New Roman" w:cs="Times New Roman"/>
-        </w:rPr>
-      </w:pPr>
-      <w:r>
-        <w:rPr>
-          <w:rFonts w:ascii="Times New Roman" w:hAnsi="Times New Roman" w:cs="Times New Roman"/>
+      </w:pPr>
+      <w:r>
+        <w:rPr>
           <w:b/>
           <w:bCs/>
           <w:sz w:val="24"/>
@@ -262,11 +362,10 @@
       </w:r>
       <w:r>
         <w:rPr>
-          <w:rFonts w:ascii="Times New Roman" w:hAnsi="Times New Roman" w:cs="Times New Roman"/>
-          <w:sz w:val="24"/>
-          <w:szCs w:val="24"/>
-        </w:rPr>
-        <w:t xml:space="preserve">Синхронная модель (Flask, threaded-режим WSGI-сервера) обслуживает каждое соединение в отдельном потоке ОС. При выполнении CPU-bound операции глобальная блокировка интерпретатора (GIL) переключается между потоками каждые ~5 мс [5], поэтому ни один запрос не блокируется полностью — все потоки продвигаются, пусть и с конкуренцией за процессор. Асинхронная модель (FastAPI/uvicorn) обслуживает все соединения одним event loop в одном потоке: пока выполняется корутина, event loop не может переключиться на обработку другого запроса, если только корутина не отдаёт управление через await [6]. Если в event loop попадает синхронная CPU-bound операция без вынесения в executor — распространённая на практике ошибка [6] — event loop останавливается полностью на всё время её выполнения, и все остальные конкурентные запросы, включая лёгкие I/O-bound, простаивают. Это ключевая архитектурная асимметрия, которую эксплуатирует адаптивная маршрутизация: направлять CPU-bound запросы на синхронный движок, а I/O-bound — на асинхронный.</w:t>
+          <w:sz w:val="24"/>
+          <w:szCs w:val="24"/>
+        </w:rPr>
+        <w:t>Синхронная модель (Flask, threaded-режим WSGI-сервера) обслуживает каждое соединение в отдельном потоке ОС. При выполнении CPU-bound операции глобальная блокировка интерпретатора (GIL) переключается между потоками каждые ~5 мс [5], поэтому ни один запрос не блокируется полностью — все потоки продвигаются, пусть и с конкуренцией за процессор. Асинхронная модель (FastAPI/uvicorn) обслуживает все соединения одним event loop в одном потоке: пока выполняется корутина, event loop не может переключиться на обработку другого запроса, если только корутина не отдаёт управление через await [6]. Если в event loop попадает синхронная CPU-bound операция без вынесения в executor — распространённая на практике ошибка [6] — event loop останавливается полностью на всё время её выполнения, и все остальные конкурентные запросы, включая лёгкие I/O-bound, простаивают. Это ключевая архитектурная асимметрия, которую эксплуатирует адаптивная маршрутизация: направлять CPU-bound запросы на синхронный движок, а I/O-bound — на асинхронный.</w:t>
       </w:r>
     </w:p>
     <w:p>
@@ -274,13 +373,9 @@
         <w:spacing w:before="240" w:line="360" w:lineRule="auto"/>
         <w:ind w:firstLine="709"/>
         <w:jc w:val="both"/>
-        <w:rPr>
-          <w:rFonts w:ascii="Times New Roman" w:hAnsi="Times New Roman" w:cs="Times New Roman"/>
-        </w:rPr>
-      </w:pPr>
-      <w:r>
-        <w:rPr>
-          <w:rFonts w:ascii="Times New Roman" w:hAnsi="Times New Roman" w:cs="Times New Roman"/>
+      </w:pPr>
+      <w:r>
+        <w:rPr>
           <w:b/>
           <w:bCs/>
           <w:sz w:val="24"/>
@@ -290,11 +385,18 @@
       </w:r>
       <w:r>
         <w:rPr>
-          <w:rFonts w:ascii="Times New Roman" w:hAnsi="Times New Roman" w:cs="Times New Roman"/>
-          <w:sz w:val="24"/>
-          <w:szCs w:val="24"/>
-        </w:rPr>
-        <w:t xml:space="preserve">Прототип состоит из трёх независимых процессов: backend-сервисов на Flask (:5000) и FastAPI (:8000) и API-шлюза (:9000) [7] на FastAPI с асинхронным HTTP-клиентом httpx. Тип имитируемой работы каждого запроса — I/O-ожидание либо настоящее CPU-bound вычисление (busy-loop) — определяется его собственным параметром io_intensity: при io_intensity ≥ 0,15 выполняется I/O-ожидание (time.sleep/asyncio.sleep), иначе выполняется busy-loop; в FastAPI busy-loop намеренно выполняется напрямую внутри async-хендлера, без вынесения в executor, воспроизводя реалистичный сценарий блокировки event loop. Управляющий компонент AdaptiveRouter содержит полносвязную нейросетевую модель (PyTorch, архитектура 3–16–8–1, ReLU, сигмоида на выходе [8]), которая по трём признакам запроса (load, io_intensity, cpu_usage) предсказывает вероятность того, что запрос I/O-bound, и направляет его на FastAPI либо Flask. Разметка обучающих данных физически привязана к тому же правилу, что определяет поведение бэкендов (io_intensity ≥ 0,15 → FastAPI, иначе — Flask), а не задана произвольно. Обучение производилось на 10000 синтетических записях (random_state=42); точность на отложенной выборке составила 99,7%, среднее время принятия решения — менее 2 мс, что исключает модель как источник узких мест.</w:t>
+          <w:sz w:val="24"/>
+          <w:szCs w:val="24"/>
+        </w:rPr>
+        <w:t xml:space="preserve">Прототип состоит из трёх независимых процессов: backend-сервисов на Flask (:5000) и FastAPI (:8000) и API-шлюза (:9000) [7] на FastAPI с асинхронным HTTP-клиентом httpx. Тип имитируемой работы каждого запроса — I/O-ожидание либо настоящее CPU-bound вычисление (busy-loop) — определяется его собственным параметром io_intensity: при io_intensity ≥ 0,15 выполняется I/O-ожидание (time.sleep/asyncio.sleep), иначе выполняется busy-loop; в FastAPI busy-loop намеренно выполняется напрямую внутри async-хендлера, без вынесения в executor, воспроизводя реалистичный сценарий блокировки event </w:t>
+      </w:r>
+      <w:r>
+        <w:rPr>
+          <w:sz w:val="24"/>
+          <w:szCs w:val="24"/>
+        </w:rPr>
+        <w:lastRenderedPageBreak/>
+        <w:t>loop. Управляющий компонент AdaptiveRouter содержит полносвязную нейросетевую модель (PyTorch, архитектура 3–16–8–1, ReLU, сигмоида на выходе [8]), которая по трём признакам запроса (load, io_intensity, cpu_usage) предсказывает вероятность того, что запрос I/O-bound, и направляет его на FastAPI либо Flask. Разметка обучающих данных физически привязана к тому же правилу, что определяет поведение бэкендов (io_intensity ≥ 0,15 → FastAPI, иначе — Flask), а не задана произвольно. Обучение производилось на 10000 синтетических записях (random_state=42); точность на отложенной выборке составила 99,7%, среднее время принятия решения — менее 2 мс, что исключает модель как источник узких мест.</w:t>
       </w:r>
     </w:p>
     <w:p>
@@ -302,13 +404,9 @@
         <w:spacing w:before="240" w:line="360" w:lineRule="auto"/>
         <w:ind w:firstLine="709"/>
         <w:jc w:val="both"/>
-        <w:rPr>
-          <w:rFonts w:ascii="Times New Roman" w:hAnsi="Times New Roman" w:cs="Times New Roman"/>
-        </w:rPr>
-      </w:pPr>
-      <w:r>
-        <w:rPr>
-          <w:rFonts w:ascii="Times New Roman" w:hAnsi="Times New Roman" w:cs="Times New Roman"/>
+      </w:pPr>
+      <w:r>
+        <w:rPr>
           <w:b/>
           <w:bCs/>
           <w:sz w:val="24"/>
@@ -318,11 +416,10 @@
       </w:r>
       <w:r>
         <w:rPr>
-          <w:rFonts w:ascii="Times New Roman" w:hAnsi="Times New Roman" w:cs="Times New Roman"/>
-          <w:sz w:val="24"/>
-          <w:szCs w:val="24"/>
-        </w:rPr>
-        <w:t xml:space="preserve">Первая версия прототипа эмулировала нагрузку в обоих backend'ах идентичным sleep(0,1) независимо от типа запроса. При такой постановке между Flask и FastAPI физически нет разницы в скорости обработки одного и того же запроса, поэтому у маршрутизации не может быть выигрыша — только фиксированные накладные расходы шлюза (дополнительный сетевой переход и однопоточное принятие решения). Нагрузочное тестирование независимой утилитой hey при конкурентности 10–50 подтвердило это: adaptive оказался медленнее лучшего одиночного движка на 5–56%, гипотеза не подтвердилась. Контрольный замер времени обработки запроса самим backend-сервером (без учёта очередей шлюза) показал, что классификатор корректно определяет целевой движок и backend-серверы функционируют с прежней скоростью — то есть падение пропускной способности обусловлено исключительно архитектурными издержками шлюзового слоя, а не ошибками маршрутизации. Это наблюдение стало основанием для пересмотра модели нагрузки: чтобы у адаптивной маршрутизации в принципе была возможность выиграть, движки должны реально отличаться по тому, как быстро и безопасно они обрабатывают разные типы запросов.</w:t>
+          <w:sz w:val="24"/>
+          <w:szCs w:val="24"/>
+        </w:rPr>
+        <w:t>Первая версия прототипа эмулировала нагрузку в обоих backend'ах идентичным sleep(0,1) независимо от типа запроса. При такой постановке между Flask и FastAPI физически нет разницы в скорости обработки одного и того же запроса, поэтому у маршрутизации не может быть выигрыша — только фиксированные накладные расходы шлюза (дополнительный сетевой переход и однопоточное принятие решения). Нагрузочное тестирование независимой утилитой hey при конкурентности 10–50 подтвердило это: adaptive оказался медленнее лучшего одиночного движка на 5–56%, гипотеза не подтвердилась. Контрольный замер времени обработки запроса самим backend-сервером (без учёта очередей шлюза) показал, что классификатор корректно определяет целевой движок и backend-серверы функционируют с прежней скоростью — то есть падение пропускной способности обусловлено исключительно архитектурными издержками шлюзового слоя, а не ошибками маршрутизации. Это наблюдение стало основанием для пересмотра модели нагрузки: чтобы у адаптивной маршрутизации в принципе была возможность выиграть, движки должны реально отличаться по тому, как быстро и безопасно они обрабатывают разные типы запросов.</w:t>
       </w:r>
     </w:p>
     <w:p>
@@ -331,12 +428,12 @@
         <w:ind w:firstLine="709"/>
         <w:jc w:val="both"/>
         <w:rPr>
-          <w:rFonts w:ascii="Times New Roman" w:hAnsi="Times New Roman" w:cs="Times New Roman"/>
-        </w:rPr>
-      </w:pPr>
-      <w:r>
-        <w:rPr>
-          <w:rFonts w:ascii="Times New Roman" w:hAnsi="Times New Roman" w:cs="Times New Roman"/>
+          <w:sz w:val="24"/>
+          <w:szCs w:val="24"/>
+        </w:rPr>
+      </w:pPr>
+      <w:r>
+        <w:rPr>
           <w:b/>
           <w:bCs/>
           <w:sz w:val="24"/>
@@ -346,11 +443,20 @@
       </w:r>
       <w:r>
         <w:rPr>
-          <w:rFonts w:ascii="Times New Roman" w:hAnsi="Times New Roman" w:cs="Times New Roman"/>
-          <w:sz w:val="24"/>
-          <w:szCs w:val="24"/>
-        </w:rPr>
-        <w:t xml:space="preserve">Утилита hey отправляет один и тот же payload на все запросы, поэтому для проверки на подлинно перемежающемся смешанном потоке (I/O-bound и CPU-bound запросы конкурируют за один процесс одновременно, а не последовательными фазами) был реализован собственный асинхронный генератор нагрузки на httpx: параллельные клиенты непрерывно отправляют запросы на одну цель, случайно выбирая I/O-bound (70%) или CPU-bound (30%) payload. На одном и том же потоке сравнивались три сценария — adaptive-шлюз, Flask-only и FastAPI-only — при конкурентности 20, 50 и 100. Результаты сведены в таблице 1.</w:t>
+          <w:sz w:val="24"/>
+          <w:szCs w:val="24"/>
+        </w:rPr>
+        <w:t>Утилита hey отправляет один и тот же payload на все запросы, поэтому для проверки на подлинно перемежающемся смешанном потоке (I/O-bound и CPU-bound запросы конкурируют за один процесс одновременно, а не последовательными фазами) был реализован собственный асинхронный генератор нагрузки на httpx: параллельные клиенты непрерывно отправляют запросы на одну цель, случайно выбирая I/O-bound (70%) или CPU-bound (30%) payload. На одном и том же потоке сравнивались три сценария — adaptive-шлюз, Flask-only и FastAPI-only — при конкурентности 20, 50 и 100. Результаты сведены в таблице 1.</w:t>
+      </w:r>
+    </w:p>
+    <w:p>
+      <w:pPr>
+        <w:spacing w:before="240" w:line="360" w:lineRule="auto"/>
+        <w:ind w:firstLine="709"/>
+        <w:jc w:val="both"/>
+      </w:pPr>
+      <w:r>
+        <w:t>Таблица 1 – Пропускная способность на перемежающемся смешанном потоке (70% I/O-bound + 30% CPU-bound)</w:t>
       </w:r>
     </w:p>
     <w:tbl>
@@ -386,16 +492,13 @@
             <w:pPr>
               <w:spacing w:line="360" w:lineRule="auto"/>
               <w:jc w:val="center"/>
-              <w:rPr>
-                <w:rFonts w:ascii="Times New Roman" w:hAnsi="Times New Roman" w:cs="Times New Roman"/>
-              </w:rPr>
             </w:pPr>
             <w:r>
               <w:rPr>
-                <w:rFonts w:ascii="Times New Roman" w:hAnsi="Times New Roman" w:cs="Times New Roman"/>
                 <w:b/>
                 <w:bCs/>
               </w:rPr>
+              <w:lastRenderedPageBreak/>
               <w:t>Конкурентность</w:t>
             </w:r>
           </w:p>
@@ -408,13 +511,9 @@
             <w:pPr>
               <w:spacing w:line="360" w:lineRule="auto"/>
               <w:jc w:val="center"/>
-              <w:rPr>
-                <w:rFonts w:ascii="Times New Roman" w:hAnsi="Times New Roman" w:cs="Times New Roman"/>
-              </w:rPr>
             </w:pPr>
             <w:r>
               <w:rPr>
-                <w:rFonts w:ascii="Times New Roman" w:hAnsi="Times New Roman" w:cs="Times New Roman"/>
                 <w:b/>
                 <w:bCs/>
               </w:rPr>
@@ -430,13 +529,9 @@
             <w:pPr>
               <w:spacing w:line="360" w:lineRule="auto"/>
               <w:jc w:val="center"/>
-              <w:rPr>
-                <w:rFonts w:ascii="Times New Roman" w:hAnsi="Times New Roman" w:cs="Times New Roman"/>
-              </w:rPr>
             </w:pPr>
             <w:r>
               <w:rPr>
-                <w:rFonts w:ascii="Times New Roman" w:hAnsi="Times New Roman" w:cs="Times New Roman"/>
                 <w:b/>
                 <w:bCs/>
               </w:rPr>
@@ -452,13 +547,9 @@
             <w:pPr>
               <w:spacing w:line="360" w:lineRule="auto"/>
               <w:jc w:val="center"/>
-              <w:rPr>
-                <w:rFonts w:ascii="Times New Roman" w:hAnsi="Times New Roman" w:cs="Times New Roman"/>
-              </w:rPr>
             </w:pPr>
             <w:r>
               <w:rPr>
-                <w:rFonts w:ascii="Times New Roman" w:hAnsi="Times New Roman" w:cs="Times New Roman"/>
                 <w:b/>
                 <w:bCs/>
               </w:rPr>
@@ -474,13 +565,9 @@
             <w:pPr>
               <w:spacing w:line="360" w:lineRule="auto"/>
               <w:jc w:val="center"/>
-              <w:rPr>
-                <w:rFonts w:ascii="Times New Roman" w:hAnsi="Times New Roman" w:cs="Times New Roman"/>
-              </w:rPr>
             </w:pPr>
             <w:r>
               <w:rPr>
-                <w:rFonts w:ascii="Times New Roman" w:hAnsi="Times New Roman" w:cs="Times New Roman"/>
                 <w:b/>
                 <w:bCs/>
               </w:rPr>
@@ -498,14 +585,8 @@
             <w:pPr>
               <w:spacing w:line="360" w:lineRule="auto"/>
               <w:jc w:val="center"/>
-              <w:rPr>
-                <w:rFonts w:ascii="Times New Roman" w:hAnsi="Times New Roman" w:cs="Times New Roman"/>
-              </w:rPr>
             </w:pPr>
             <w:r>
-              <w:rPr>
-                <w:rFonts w:ascii="Times New Roman" w:hAnsi="Times New Roman" w:cs="Times New Roman"/>
-              </w:rPr>
               <w:t>20</w:t>
             </w:r>
           </w:p>
@@ -518,14 +599,8 @@
             <w:pPr>
               <w:spacing w:line="360" w:lineRule="auto"/>
               <w:jc w:val="center"/>
-              <w:rPr>
-                <w:rFonts w:ascii="Times New Roman" w:hAnsi="Times New Roman" w:cs="Times New Roman"/>
-              </w:rPr>
             </w:pPr>
             <w:r>
-              <w:rPr>
-                <w:rFonts w:ascii="Times New Roman" w:hAnsi="Times New Roman" w:cs="Times New Roman"/>
-              </w:rPr>
               <w:t>44,75</w:t>
             </w:r>
           </w:p>
@@ -538,14 +613,8 @@
             <w:pPr>
               <w:spacing w:line="360" w:lineRule="auto"/>
               <w:jc w:val="center"/>
-              <w:rPr>
-                <w:rFonts w:ascii="Times New Roman" w:hAnsi="Times New Roman" w:cs="Times New Roman"/>
-              </w:rPr>
             </w:pPr>
             <w:r>
-              <w:rPr>
-                <w:rFonts w:ascii="Times New Roman" w:hAnsi="Times New Roman" w:cs="Times New Roman"/>
-              </w:rPr>
               <w:t>32,15</w:t>
             </w:r>
           </w:p>
@@ -558,14 +627,8 @@
             <w:pPr>
               <w:spacing w:line="360" w:lineRule="auto"/>
               <w:jc w:val="center"/>
-              <w:rPr>
-                <w:rFonts w:ascii="Times New Roman" w:hAnsi="Times New Roman" w:cs="Times New Roman"/>
-              </w:rPr>
             </w:pPr>
             <w:r>
-              <w:rPr>
-                <w:rFonts w:ascii="Times New Roman" w:hAnsi="Times New Roman" w:cs="Times New Roman"/>
-              </w:rPr>
               <w:t>12,43</w:t>
             </w:r>
           </w:p>
@@ -578,14 +641,8 @@
             <w:pPr>
               <w:spacing w:line="360" w:lineRule="auto"/>
               <w:jc w:val="center"/>
-              <w:rPr>
-                <w:rFonts w:ascii="Times New Roman" w:hAnsi="Times New Roman" w:cs="Times New Roman"/>
-              </w:rPr>
             </w:pPr>
             <w:r>
-              <w:rPr>
-                <w:rFonts w:ascii="Times New Roman" w:hAnsi="Times New Roman" w:cs="Times New Roman"/>
-              </w:rPr>
               <w:t>+39,2</w:t>
             </w:r>
           </w:p>
@@ -600,14 +657,8 @@
             <w:pPr>
               <w:spacing w:line="360" w:lineRule="auto"/>
               <w:jc w:val="center"/>
-              <w:rPr>
-                <w:rFonts w:ascii="Times New Roman" w:hAnsi="Times New Roman" w:cs="Times New Roman"/>
-              </w:rPr>
             </w:pPr>
             <w:r>
-              <w:rPr>
-                <w:rFonts w:ascii="Times New Roman" w:hAnsi="Times New Roman" w:cs="Times New Roman"/>
-              </w:rPr>
               <w:t>50</w:t>
             </w:r>
           </w:p>
@@ -620,14 +671,8 @@
             <w:pPr>
               <w:spacing w:line="360" w:lineRule="auto"/>
               <w:jc w:val="center"/>
-              <w:rPr>
-                <w:rFonts w:ascii="Times New Roman" w:hAnsi="Times New Roman" w:cs="Times New Roman"/>
-              </w:rPr>
             </w:pPr>
             <w:r>
-              <w:rPr>
-                <w:rFonts w:ascii="Times New Roman" w:hAnsi="Times New Roman" w:cs="Times New Roman"/>
-              </w:rPr>
               <w:t>56,18</w:t>
             </w:r>
           </w:p>
@@ -640,14 +685,8 @@
             <w:pPr>
               <w:spacing w:line="360" w:lineRule="auto"/>
               <w:jc w:val="center"/>
-              <w:rPr>
-                <w:rFonts w:ascii="Times New Roman" w:hAnsi="Times New Roman" w:cs="Times New Roman"/>
-              </w:rPr>
             </w:pPr>
             <w:r>
-              <w:rPr>
-                <w:rFonts w:ascii="Times New Roman" w:hAnsi="Times New Roman" w:cs="Times New Roman"/>
-              </w:rPr>
               <w:t>31,25</w:t>
             </w:r>
           </w:p>
@@ -660,14 +699,8 @@
             <w:pPr>
               <w:spacing w:line="360" w:lineRule="auto"/>
               <w:jc w:val="center"/>
-              <w:rPr>
-                <w:rFonts w:ascii="Times New Roman" w:hAnsi="Times New Roman" w:cs="Times New Roman"/>
-              </w:rPr>
             </w:pPr>
             <w:r>
-              <w:rPr>
-                <w:rFonts w:ascii="Times New Roman" w:hAnsi="Times New Roman" w:cs="Times New Roman"/>
-              </w:rPr>
               <w:t>11,16</w:t>
             </w:r>
           </w:p>
@@ -680,14 +713,8 @@
             <w:pPr>
               <w:spacing w:line="360" w:lineRule="auto"/>
               <w:jc w:val="center"/>
-              <w:rPr>
-                <w:rFonts w:ascii="Times New Roman" w:hAnsi="Times New Roman" w:cs="Times New Roman"/>
-              </w:rPr>
             </w:pPr>
             <w:r>
-              <w:rPr>
-                <w:rFonts w:ascii="Times New Roman" w:hAnsi="Times New Roman" w:cs="Times New Roman"/>
-              </w:rPr>
               <w:t>+79,8</w:t>
             </w:r>
           </w:p>
@@ -702,14 +729,8 @@
             <w:pPr>
               <w:spacing w:line="360" w:lineRule="auto"/>
               <w:jc w:val="center"/>
-              <w:rPr>
-                <w:rFonts w:ascii="Times New Roman" w:hAnsi="Times New Roman" w:cs="Times New Roman"/>
-              </w:rPr>
             </w:pPr>
             <w:r>
-              <w:rPr>
-                <w:rFonts w:ascii="Times New Roman" w:hAnsi="Times New Roman" w:cs="Times New Roman"/>
-              </w:rPr>
               <w:t>100</w:t>
             </w:r>
           </w:p>
@@ -722,14 +743,8 @@
             <w:pPr>
               <w:spacing w:line="360" w:lineRule="auto"/>
               <w:jc w:val="center"/>
-              <w:rPr>
-                <w:rFonts w:ascii="Times New Roman" w:hAnsi="Times New Roman" w:cs="Times New Roman"/>
-              </w:rPr>
             </w:pPr>
             <w:r>
-              <w:rPr>
-                <w:rFonts w:ascii="Times New Roman" w:hAnsi="Times New Roman" w:cs="Times New Roman"/>
-              </w:rPr>
               <w:t>58,47</w:t>
             </w:r>
           </w:p>
@@ -742,14 +757,8 @@
             <w:pPr>
               <w:spacing w:line="360" w:lineRule="auto"/>
               <w:jc w:val="center"/>
-              <w:rPr>
-                <w:rFonts w:ascii="Times New Roman" w:hAnsi="Times New Roman" w:cs="Times New Roman"/>
-              </w:rPr>
             </w:pPr>
             <w:r>
-              <w:rPr>
-                <w:rFonts w:ascii="Times New Roman" w:hAnsi="Times New Roman" w:cs="Times New Roman"/>
-              </w:rPr>
               <w:t>31,30</w:t>
             </w:r>
           </w:p>
@@ -762,14 +771,8 @@
             <w:pPr>
               <w:spacing w:line="360" w:lineRule="auto"/>
               <w:jc w:val="center"/>
-              <w:rPr>
-                <w:rFonts w:ascii="Times New Roman" w:hAnsi="Times New Roman" w:cs="Times New Roman"/>
-              </w:rPr>
             </w:pPr>
             <w:r>
-              <w:rPr>
-                <w:rFonts w:ascii="Times New Roman" w:hAnsi="Times New Roman" w:cs="Times New Roman"/>
-              </w:rPr>
               <w:t>11,70</w:t>
             </w:r>
           </w:p>
@@ -782,14 +785,8 @@
             <w:pPr>
               <w:spacing w:line="360" w:lineRule="auto"/>
               <w:jc w:val="center"/>
-              <w:rPr>
-                <w:rFonts w:ascii="Times New Roman" w:hAnsi="Times New Roman" w:cs="Times New Roman"/>
-              </w:rPr>
             </w:pPr>
             <w:r>
-              <w:rPr>
-                <w:rFonts w:ascii="Times New Roman" w:hAnsi="Times New Roman" w:cs="Times New Roman"/>
-              </w:rPr>
               <w:t>+86,8</w:t>
             </w:r>
           </w:p>
@@ -798,71 +795,44 @@
     </w:tbl>
     <w:p>
       <w:pPr>
-        <w:spacing w:after="200" w:line="360" w:lineRule="auto"/>
-        <w:jc w:val="center"/>
-        <w:rPr>
-          <w:rFonts w:ascii="Times New Roman" w:hAnsi="Times New Roman" w:cs="Times New Roman"/>
-        </w:rPr>
-      </w:pPr>
-      <w:r>
-        <w:rPr>
-          <w:rFonts w:ascii="Times New Roman" w:hAnsi="Times New Roman" w:cs="Times New Roman"/>
-        </w:rPr>
-        <w:t>Таблица 1 – Пропускная способность на перемежающемся смешанном потоке (70% I/O-bound + 30% CPU-bound)</w:t>
-      </w:r>
-    </w:p>
-    <w:p>
-      <w:pPr>
-        <w:spacing w:after="0" w:line="360" w:lineRule="auto"/>
+        <w:spacing w:line="360" w:lineRule="auto"/>
         <w:ind w:firstLine="709"/>
         <w:jc w:val="both"/>
-        <w:rPr>
-          <w:rFonts w:ascii="Times New Roman" w:hAnsi="Times New Roman" w:cs="Times New Roman"/>
-        </w:rPr>
-      </w:pPr>
-      <w:r>
-        <w:rPr>
-          <w:rFonts w:ascii="Times New Roman" w:hAnsi="Times New Roman" w:cs="Times New Roman"/>
-          <w:sz w:val="24"/>
-          <w:szCs w:val="24"/>
-        </w:rPr>
-        <w:t xml:space="preserve">Прирост пропускной способности adaptive относительно лучшего одиночного движка растёт вместе с конкурентностью — с 39,2% при 20 до 86,8% при 100 одновременных клиентах. Средняя задержка adaptive ниже, чем у Flask-only, в 1,8–2,4 раза, и ниже, чем у FastAPI-only, в 2,7–6,1 раза; при конкурентности 100 у FastAPI-only дополнительно фиксируются отказы по таймауту (14 из 1500 запросов), которых нет ни у Flask-only, ни у adaptive.</w:t>
-      </w:r>
-    </w:p>
-    <w:p>
-      <w:pPr>
-        <w:spacing w:after="0" w:line="360" w:lineRule="auto"/>
+      </w:pPr>
+      <w:r>
+        <w:rPr>
+          <w:sz w:val="24"/>
+          <w:szCs w:val="24"/>
+        </w:rPr>
+        <w:t>Прирост пропускной способности adaptive относительно лучшего одиночного движка растёт вместе с конкурентностью — с 39,2% при 20 до 86,8% при 100 одновременных клиентах. Средняя задержка adaptive ниже, чем у Flask-only, в 1,8–2,4 раза, и ниже, чем у FastAPI-only, в 2,7–6,1 раза; при конкурентности 100 у FastAPI-only дополнительно фиксируются отказы по таймауту (14 из 1500 запросов), которых нет ни у Flask-only, ни у adaptive.</w:t>
+      </w:r>
+    </w:p>
+    <w:p>
+      <w:pPr>
+        <w:spacing w:line="360" w:lineRule="auto"/>
         <w:ind w:firstLine="709"/>
         <w:jc w:val="both"/>
-        <w:rPr>
-          <w:rFonts w:ascii="Times New Roman" w:hAnsi="Times New Roman" w:cs="Times New Roman"/>
-        </w:rPr>
-      </w:pPr>
-      <w:r>
-        <w:rPr>
-          <w:rFonts w:ascii="Times New Roman" w:hAnsi="Times New Roman" w:cs="Times New Roman"/>
-          <w:sz w:val="24"/>
-          <w:szCs w:val="24"/>
-        </w:rPr>
-        <w:t xml:space="preserve">Физический механизм эффекта: у FastAPI один event loop на процесс, и CPU-bound busy-loop, выполненный напрямую в async-хендлере, останавливает обработку всех остальных запросов на время вычисления — в том числе I/O-bound запросов, которые сами по себе обработались бы почти мгновенно; с ростом конкурентности вероятность такой блокировки для случайного запроса растёт, поэтому деградация FastAPI-only не выправляется, а усугубляется. У Flask катастрофического отказа нет — каждый запрос выполняется в своём OS-потоке, и GIL переключается между потоками каждые ~5 мс, — но пул потоков дороже держать под большим числом конкурентных I/O-ожиданий, чем event loop, поэтому throughput Flask-only выходит на плато. Адаптивная маршрутизация ограждает FastAPI от CPU-bound трафика и не нагружает Flask I/O-bound трафиком, избегая обеих слабых сторон одновременно.</w:t>
-      </w:r>
-    </w:p>
-    <w:p>
-      <w:pPr>
-        <w:spacing w:after="0" w:line="360" w:lineRule="auto"/>
+      </w:pPr>
+      <w:r>
+        <w:rPr>
+          <w:sz w:val="24"/>
+          <w:szCs w:val="24"/>
+        </w:rPr>
+        <w:t>Физический механизм эффекта: у FastAPI один event loop на процесс, и CPU-bound busy-loop, выполненный напрямую в async-хендлере, останавливает обработку всех остальных запросов на время вычисления — в том числе I/O-bound запросов, которые сами по себе обработались бы почти мгновенно; с ростом конкурентности вероятность такой блокировки для случайного запроса растёт, поэтому деградация FastAPI-only не выправляется, а усугубляется. У Flask катастрофического отказа нет — каждый запрос выполняется в своём OS-потоке, и GIL переключается между потоками каждые ~5 мс, — но пул потоков дороже держать под большим числом конкурентных I/O-ожиданий, чем event loop, поэтому throughput Flask-only выходит на плато. Адаптивная маршрутизация ограждает FastAPI от CPU-bound трафика и не нагружает Flask I/O-bound трафиком, избегая обеих слабых сторон одновременно.</w:t>
+      </w:r>
+    </w:p>
+    <w:p>
+      <w:pPr>
+        <w:spacing w:line="360" w:lineRule="auto"/>
         <w:ind w:firstLine="709"/>
         <w:jc w:val="both"/>
-        <w:rPr>
-          <w:rFonts w:ascii="Times New Roman" w:hAnsi="Times New Roman" w:cs="Times New Roman"/>
-        </w:rPr>
-      </w:pPr>
-      <w:r>
-        <w:rPr>
-          <w:rFonts w:ascii="Times New Roman" w:hAnsi="Times New Roman" w:cs="Times New Roman"/>
-          <w:sz w:val="24"/>
-          <w:szCs w:val="24"/>
-        </w:rPr>
-        <w:t xml:space="preserve">Отдельно стоит отметить: по throughput и средней задержке adaptive превосходит оба одиночных движка, но по p95/p99-задержке [9] уступает Flask-only (например, p99 при конкурентности 50: 3110 мс у adaptive против 1982 мс у Flask-only, хотя и заметно лучше 7524 мс у FastAPI-only). Причина та же, что и в пилотном эксперименте, — однопоточное принятие решений в шлюзе: решения по всем конкурентным запросам сериализуются на одном ядре, и эта сериализация добавляет хвостовую задержку, не устранённую пересмотром модели нагрузки. Таким образом, выигрыш адаптивной маршрутизации в данном эксперименте достигается за счёт устранения катастрофического отказа FastAPI-only, а не за счёт идеальной архитектуры самого шлюза.</w:t>
+      </w:pPr>
+      <w:r>
+        <w:rPr>
+          <w:sz w:val="24"/>
+          <w:szCs w:val="24"/>
+        </w:rPr>
+        <w:t>Отдельно стоит отметить: по throughput и средней задержке adaptive превосходит оба одиночных движка, но по p95/p99-задержке [9] уступает Flask-only (например, p99 при конкурентности 50: 3110 мс у adaptive против 1982 мс у Flask-only, хотя и заметно лучше 7524 мс у FastAPI-only). Причина та же, что и в пилотном эксперименте, — однопоточное принятие решений в шлюзе: решения по всем конкурентным запросам сериализуются на одном ядре, и эта сериализация добавляет хвостовую задержку, не устранённую пересмотром модели нагрузки. Таким образом, выигрыш адаптивной маршрутизации в данном эксперименте достигается за счёт устранения катастрофического отказа FastAPI-only, а не за счёт идеальной архитектуры самого шлюза.</w:t>
       </w:r>
     </w:p>
     <w:p>
@@ -870,13 +840,9 @@
         <w:spacing w:before="240" w:line="360" w:lineRule="auto"/>
         <w:ind w:firstLine="709"/>
         <w:jc w:val="both"/>
-        <w:rPr>
-          <w:rFonts w:ascii="Times New Roman" w:hAnsi="Times New Roman" w:cs="Times New Roman"/>
-        </w:rPr>
-      </w:pPr>
-      <w:r>
-        <w:rPr>
-          <w:rFonts w:ascii="Times New Roman" w:hAnsi="Times New Roman" w:cs="Times New Roman"/>
+      </w:pPr>
+      <w:r>
+        <w:rPr>
           <w:b/>
           <w:bCs/>
           <w:sz w:val="24"/>
@@ -886,62 +852,53 @@
       </w:r>
       <w:r>
         <w:rPr>
-          <w:rFonts w:ascii="Times New Roman" w:hAnsi="Times New Roman" w:cs="Times New Roman"/>
-          <w:sz w:val="24"/>
-          <w:szCs w:val="24"/>
-        </w:rPr>
-        <w:t xml:space="preserve">Экспериментальным путём установлено, что адаптивная маршрутизация запросов на основе обученного классификатора обеспечивает прирост пропускной способности на 39–87% и снижение средней задержки в 1,8–6,1 раза относительно лучшего одиночного движка — но только при гетерогенном потоке запросов, где часть трафика CPU-bound, а часть I/O-bound; на однородном потоке (пилотный эксперимент) выигрыша нет физически, поскольку движкам в этом случае нечего выбирать. Точность классификации (99,7% при задержке решения менее 2 мс) не является узким местом; ограничивающий фактор — однопоточное принятие решений в шлюзе, ухудшающее p95/p99-задержку относительно синхронного движка. Практическая ценность работы — количественный критерий целесообразности: адаптивная маршрутизация между sync- и async-движками оправдана там, где CPU-bound запросы рискуют заблокировать event loop асинхронного сервиса, то есть в системах со смешанным профилем нагрузки (например, короткие API-запросы вперемешку с генерацией отчётов, сжатием изображений или другими вычислительно тяжёлыми операциями). В качестве направлений дальнейших изысканий рассматриваются: вынесение принятия решения в пул потоков/процессов для устранения хвостовой задержки, тестирование на реальных профилях трафика и сравнение с альтернативой в виде вынесения CPU-bound работы в executor средствами самого async-фреймворка.</w:t>
+          <w:sz w:val="24"/>
+          <w:szCs w:val="24"/>
+        </w:rPr>
+        <w:t xml:space="preserve">Экспериментальным путём установлено, что адаптивная маршрутизация запросов на основе обученного классификатора обеспечивает прирост пропускной способности на 39–87% и снижение средней задержки в 1,8–6,1 раза относительно лучшего одиночного движка — но только при гетерогенном потоке запросов, где часть трафика CPU-bound, а часть I/O-bound; на однородном потоке (пилотный эксперимент) выигрыша нет </w:t>
+      </w:r>
+      <w:r>
+        <w:rPr>
+          <w:sz w:val="24"/>
+          <w:szCs w:val="24"/>
+        </w:rPr>
+        <w:lastRenderedPageBreak/>
+        <w:t>физически, поскольку движкам в этом случае нечего выбирать. Точность классификации (99,7% при задержке решения менее 2 мс) не является узким местом; ограничивающий фактор — однопоточное принятие решений в шлюзе, ухудшающее p95/p99-задержку относительно синхронного движка. Практическая ценность работы — количественный критерий целесообразности: адаптивная маршрутизация между sync- и async-движками оправдана там, где CPU-bound запросы рискуют заблокировать event loop асинхронного сервиса, то есть в системах со смешанным профилем нагрузки (например, короткие API-запросы вперемешку с генерацией отчётов, сжатием изображений или другими вычислительно тяжёлыми операциями). В качестве направлений дальнейших изысканий рассматриваются: вынесение принятия решения в пул потоков/процессов для устранения хвостовой задержки, тестирование на реальных профилях трафика и сравнение с альтернативой в виде вынесения CPU-bound работы в executor средствами самого async-фреймворка.</w:t>
       </w:r>
     </w:p>
     <w:p>
       <w:pPr>
         <w:spacing w:after="150" w:line="360" w:lineRule="auto"/>
-        <w:rPr>
-          <w:rFonts w:ascii="Times New Roman" w:hAnsi="Times New Roman" w:cs="Times New Roman"/>
-        </w:rPr>
-      </w:pPr>
-      <w:r>
-        <w:rPr>
-          <w:rFonts w:ascii="Times New Roman" w:hAnsi="Times New Roman" w:cs="Times New Roman"/>
+      </w:pPr>
+      <w:r>
+        <w:rPr>
           <w:b/>
           <w:bCs/>
           <w:sz w:val="24"/>
           <w:szCs w:val="24"/>
         </w:rPr>
-        <w:t xml:space="preserve">Список источников</w:t>
+        <w:t>Список источников</w:t>
       </w:r>
     </w:p>
     <w:p>
       <w:pPr>
         <w:spacing w:after="120" w:line="360" w:lineRule="auto"/>
         <w:ind w:left="567" w:hanging="567"/>
-        <w:rPr>
-          <w:rFonts w:ascii="Times New Roman" w:hAnsi="Times New Roman" w:cs="Times New Roman"/>
-        </w:rPr>
-      </w:pPr>
-      <w:r>
-        <w:rPr>
-          <w:rFonts w:ascii="Times New Roman" w:hAnsi="Times New Roman" w:cs="Times New Roman"/>
-          <w:sz w:val="24"/>
-          <w:szCs w:val="24"/>
-        </w:rPr>
-        <w:t xml:space="preserve">[1]</w:t>
-      </w:r>
-      <w:r>
-        <w:rPr>
-          <w:rFonts w:ascii="Times New Roman" w:hAnsi="Times New Roman" w:cs="Times New Roman"/>
+      </w:pPr>
+      <w:r>
+        <w:rPr>
+          <w:sz w:val="24"/>
+          <w:szCs w:val="24"/>
+        </w:rPr>
+        <w:t>[1]</w:t>
+      </w:r>
+      <w:r>
+        <w:rPr>
           <w:sz w:val="24"/>
           <w:szCs w:val="24"/>
         </w:rPr>
         <w:tab/>
-      </w:r>
-      <w:r>
-        <w:rPr>
-          <w:rFonts w:ascii="Times New Roman" w:hAnsi="Times New Roman" w:cs="Times New Roman"/>
-          <w:sz w:val="24"/>
-          <w:szCs w:val="24"/>
-        </w:rPr>
-        <w:t xml:space="preserve">Аунг Чжо Мьо. Разработка способа балансировки нагрузки в распределенных системах обработки данных / Аунг Чжо Мьо, Е. М. Портнов, А. С. Волков, М. В. Слюсарь, А. В. Потапов // Вестник Воронежского государственного технического университета. – 2025. – Т. 21, № 1. https://doi.org/10.36622/1729-6501.2025.21.1.010</w:t>
+        <w:t>Аунг Чжо Мьо. Разработка способа балансировки нагрузки в распределенных системах обработки данных / Аунг Чжо Мьо, Е. М. Портнов, А. С. Волков, М. В. Слюсарь, А. В. Потапов // Вестник Воронежского государственного технического университета. – 2025. – Т. 21, № 1. https://doi.org/10.36622/1729-6501.2025.21.1.010</w:t>
       </w:r>
     </w:p>
     <w:p>
@@ -949,32 +906,91 @@
         <w:spacing w:after="120" w:line="360" w:lineRule="auto"/>
         <w:ind w:left="567" w:hanging="567"/>
         <w:rPr>
-          <w:rFonts w:ascii="Times New Roman" w:hAnsi="Times New Roman" w:cs="Times New Roman"/>
-        </w:rPr>
-      </w:pPr>
-      <w:r>
-        <w:rPr>
-          <w:rFonts w:ascii="Times New Roman" w:hAnsi="Times New Roman" w:cs="Times New Roman"/>
-          <w:sz w:val="24"/>
-          <w:szCs w:val="24"/>
-        </w:rPr>
-        <w:t xml:space="preserve">[2]</w:t>
-      </w:r>
-      <w:r>
-        <w:rPr>
-          <w:rFonts w:ascii="Times New Roman" w:hAnsi="Times New Roman" w:cs="Times New Roman"/>
+          <w:lang w:val="en-US"/>
+        </w:rPr>
+      </w:pPr>
+      <w:r>
+        <w:rPr>
+          <w:sz w:val="24"/>
+          <w:szCs w:val="24"/>
+        </w:rPr>
+        <w:t>[2]</w:t>
+      </w:r>
+      <w:r>
+        <w:rPr>
           <w:sz w:val="24"/>
           <w:szCs w:val="24"/>
         </w:rPr>
         <w:tab/>
-      </w:r>
-      <w:r>
-        <w:rPr>
-          <w:rFonts w:ascii="Times New Roman" w:hAnsi="Times New Roman" w:cs="Times New Roman"/>
-          <w:sz w:val="24"/>
-          <w:szCs w:val="24"/>
-        </w:rPr>
-        <w:t xml:space="preserve">Красовская, Н. В. Анализ методов балансировки сетевого трафика в высоконагруженных сетях // Вестник Новосибирского государственного университета. Серия: Информационные технологии. – 2025. – Т. 23, № 3. – С. 23–31. https://doi.org/10.25205/1818-7900-2025-23-3-23-31</w:t>
+        <w:t>Красовская, Н. В. Анализ методов балансировки сетевого трафика в высоконагруженных сетях // Вестник Новосибирского государственного университета. Серия</w:t>
+      </w:r>
+      <w:r>
+        <w:rPr>
+          <w:sz w:val="24"/>
+          <w:szCs w:val="24"/>
+          <w:lang w:val="en-US"/>
+        </w:rPr>
+        <w:t xml:space="preserve">: </w:t>
+      </w:r>
+      <w:r>
+        <w:rPr>
+          <w:sz w:val="24"/>
+          <w:szCs w:val="24"/>
+        </w:rPr>
+        <w:t>Информационные</w:t>
+      </w:r>
+      <w:r>
+        <w:rPr>
+          <w:sz w:val="24"/>
+          <w:szCs w:val="24"/>
+          <w:lang w:val="en-US"/>
+        </w:rPr>
+        <w:t xml:space="preserve"> </w:t>
+      </w:r>
+      <w:r>
+        <w:rPr>
+          <w:sz w:val="24"/>
+          <w:szCs w:val="24"/>
+        </w:rPr>
+        <w:t>технологии</w:t>
+      </w:r>
+      <w:r>
+        <w:rPr>
+          <w:sz w:val="24"/>
+          <w:szCs w:val="24"/>
+          <w:lang w:val="en-US"/>
+        </w:rPr>
+        <w:t xml:space="preserve">. – 2025. – </w:t>
+      </w:r>
+      <w:r>
+        <w:rPr>
+          <w:sz w:val="24"/>
+          <w:szCs w:val="24"/>
+        </w:rPr>
+        <w:t>Т</w:t>
+      </w:r>
+      <w:r>
+        <w:rPr>
+          <w:sz w:val="24"/>
+          <w:szCs w:val="24"/>
+          <w:lang w:val="en-US"/>
+        </w:rPr>
+        <w:t xml:space="preserve">. 23, № 3. – </w:t>
+      </w:r>
+      <w:r>
+        <w:rPr>
+          <w:sz w:val="24"/>
+          <w:szCs w:val="24"/>
+        </w:rPr>
+        <w:t>С</w:t>
+      </w:r>
+      <w:r>
+        <w:rPr>
+          <w:sz w:val="24"/>
+          <w:szCs w:val="24"/>
+          <w:lang w:val="en-US"/>
+        </w:rPr>
+        <w:t>. 23–31. https://doi.org/10.25205/1818-7900-2025-23-3-23-31</w:t>
       </w:r>
     </w:p>
     <w:p>
@@ -982,164 +998,117 @@
         <w:spacing w:after="120" w:line="360" w:lineRule="auto"/>
         <w:ind w:left="567" w:hanging="567"/>
         <w:rPr>
-          <w:rFonts w:ascii="Times New Roman" w:hAnsi="Times New Roman" w:cs="Times New Roman"/>
-        </w:rPr>
-      </w:pPr>
-      <w:r>
-        <w:rPr>
-          <w:rFonts w:ascii="Times New Roman" w:hAnsi="Times New Roman" w:cs="Times New Roman"/>
-          <w:sz w:val="24"/>
-          <w:szCs w:val="24"/>
-        </w:rPr>
-        <w:t xml:space="preserve">[3]</w:t>
-      </w:r>
-      <w:r>
-        <w:rPr>
-          <w:rFonts w:ascii="Times New Roman" w:hAnsi="Times New Roman" w:cs="Times New Roman"/>
-          <w:sz w:val="24"/>
-          <w:szCs w:val="24"/>
+          <w:lang w:val="en-US"/>
+        </w:rPr>
+      </w:pPr>
+      <w:r>
+        <w:rPr>
+          <w:sz w:val="24"/>
+          <w:szCs w:val="24"/>
+          <w:lang w:val="en-US"/>
+        </w:rPr>
+        <w:t>[3]</w:t>
+      </w:r>
+      <w:r>
+        <w:rPr>
+          <w:sz w:val="24"/>
+          <w:szCs w:val="24"/>
+          <w:lang w:val="en-US"/>
         </w:rPr>
         <w:tab/>
-      </w:r>
-      <w:r>
-        <w:rPr>
-          <w:rFonts w:ascii="Times New Roman" w:hAnsi="Times New Roman" w:cs="Times New Roman"/>
-          <w:sz w:val="24"/>
-          <w:szCs w:val="24"/>
-        </w:rPr>
-        <w:t xml:space="preserve">Grinberg, M. Flask Web Development: Developing Web Applications with Python [Text]. – 2nd ed. – Sebastopol : O'Reilly Media, 2018. – 276 p.</w:t>
+        <w:t>Grinberg, M. Flask Web Development: Developing Web Applications with Python [Text]. – 2nd ed. – Sebastopol : O'Reilly Media, 2018. – 276 p.</w:t>
       </w:r>
     </w:p>
     <w:p>
       <w:pPr>
         <w:spacing w:after="120" w:line="360" w:lineRule="auto"/>
         <w:ind w:left="567" w:hanging="567"/>
-        <w:rPr>
-          <w:rFonts w:ascii="Times New Roman" w:hAnsi="Times New Roman" w:cs="Times New Roman"/>
-        </w:rPr>
-      </w:pPr>
-      <w:r>
-        <w:rPr>
-          <w:rFonts w:ascii="Times New Roman" w:hAnsi="Times New Roman" w:cs="Times New Roman"/>
-          <w:sz w:val="24"/>
-          <w:szCs w:val="24"/>
-        </w:rPr>
-        <w:t xml:space="preserve">[4]</w:t>
-      </w:r>
-      <w:r>
-        <w:rPr>
-          <w:rFonts w:ascii="Times New Roman" w:hAnsi="Times New Roman" w:cs="Times New Roman"/>
+      </w:pPr>
+      <w:r>
+        <w:rPr>
+          <w:sz w:val="24"/>
+          <w:szCs w:val="24"/>
+        </w:rPr>
+        <w:t>[4]</w:t>
+      </w:r>
+      <w:r>
+        <w:rPr>
           <w:sz w:val="24"/>
           <w:szCs w:val="24"/>
         </w:rPr>
         <w:tab/>
-      </w:r>
-      <w:r>
-        <w:rPr>
-          <w:rFonts w:ascii="Times New Roman" w:hAnsi="Times New Roman" w:cs="Times New Roman"/>
-          <w:sz w:val="24"/>
-          <w:szCs w:val="24"/>
-        </w:rPr>
-        <w:t xml:space="preserve">Ramírez, S. FastAPI Documentation [Электронный ресурс]. – 2024. – Режим доступа: https://fastapi.tiangolo.com (дата обращения: 17.09.2026).</w:t>
+        <w:t>Ramírez, S. FastAPI Documentation [Электронный ресурс]. – 2024. – Режим доступа: https://fastapi.tiangolo.com (дата обращения: 17.09.2026).</w:t>
       </w:r>
     </w:p>
     <w:p>
       <w:pPr>
         <w:spacing w:after="120" w:line="360" w:lineRule="auto"/>
         <w:ind w:left="567" w:hanging="567"/>
-        <w:rPr>
-          <w:rFonts w:ascii="Times New Roman" w:hAnsi="Times New Roman" w:cs="Times New Roman"/>
-        </w:rPr>
-      </w:pPr>
-      <w:r>
-        <w:rPr>
-          <w:rFonts w:ascii="Times New Roman" w:hAnsi="Times New Roman" w:cs="Times New Roman"/>
-          <w:sz w:val="24"/>
-          <w:szCs w:val="24"/>
-        </w:rPr>
-        <w:t xml:space="preserve">[5]</w:t>
-      </w:r>
-      <w:r>
-        <w:rPr>
-          <w:rFonts w:ascii="Times New Roman" w:hAnsi="Times New Roman" w:cs="Times New Roman"/>
+      </w:pPr>
+      <w:r>
+        <w:rPr>
+          <w:sz w:val="24"/>
+          <w:szCs w:val="24"/>
+        </w:rPr>
+        <w:t>[5]</w:t>
+      </w:r>
+      <w:r>
+        <w:rPr>
           <w:sz w:val="24"/>
           <w:szCs w:val="24"/>
         </w:rPr>
         <w:tab/>
-      </w:r>
-      <w:r>
-        <w:rPr>
-          <w:rFonts w:ascii="Times New Roman" w:hAnsi="Times New Roman" w:cs="Times New Roman"/>
-          <w:sz w:val="24"/>
-          <w:szCs w:val="24"/>
-        </w:rPr>
-        <w:t xml:space="preserve">Макаров, И. С. Влияние асинхронных и многопоточных моделей обработки запросов на производительность серверных веб-приложений [Электронный ресурс] / И. С. Макаров, Д. В. Ларин, Е. Г. Воробьева, Д. П. Емелин, Д. А. Карташов // CyberLeninka. – 2025. – Режим доступа: https://cyberleninka.ru/article/n/vliyanie-asinhronnyh-i-mnogopotochnyh-modeley-obrabotki-zaprosov-na-proizvoditelnost-servernyh-veb-prilozheniy/pdf (дата обращения: 17.09.2026).</w:t>
+        <w:t>Макаров, И. С. Влияние асинхронных и многопоточных моделей обработки запросов на производительность серверных веб-приложений [Электронный ресурс] / И. С. Макаров, Д. В. Ларин, Е. Г. Воробьева, Д. П. Емелин, Д. А. Карташов // CyberLeninka. – 2025. – Режим доступа: https://cyberleninka.ru/article/n/vliyanie-asinhronnyh-i-mnogopotochnyh-modeley-obrabotki-zaprosov-na-proizvoditelnost-servernyh-veb-prilozheniy/pdf (дата обращения: 17.09.2026).</w:t>
       </w:r>
     </w:p>
     <w:p>
       <w:pPr>
         <w:spacing w:after="120" w:line="360" w:lineRule="auto"/>
         <w:ind w:left="567" w:hanging="567"/>
-        <w:rPr>
-          <w:rFonts w:ascii="Times New Roman" w:hAnsi="Times New Roman" w:cs="Times New Roman"/>
-        </w:rPr>
-      </w:pPr>
-      <w:r>
-        <w:rPr>
-          <w:rFonts w:ascii="Times New Roman" w:hAnsi="Times New Roman" w:cs="Times New Roman"/>
-          <w:sz w:val="24"/>
-          <w:szCs w:val="24"/>
-        </w:rPr>
-        <w:t xml:space="preserve">[6]</w:t>
-      </w:r>
-      <w:r>
-        <w:rPr>
-          <w:rFonts w:ascii="Times New Roman" w:hAnsi="Times New Roman" w:cs="Times New Roman"/>
+      </w:pPr>
+      <w:r>
+        <w:rPr>
+          <w:sz w:val="24"/>
+          <w:szCs w:val="24"/>
+        </w:rPr>
+        <w:t>[6]</w:t>
+      </w:r>
+      <w:r>
+        <w:rPr>
           <w:sz w:val="24"/>
           <w:szCs w:val="24"/>
         </w:rPr>
         <w:tab/>
-      </w:r>
-      <w:r>
-        <w:rPr>
-          <w:rFonts w:ascii="Times New Roman" w:hAnsi="Times New Roman" w:cs="Times New Roman"/>
-          <w:sz w:val="24"/>
-          <w:szCs w:val="24"/>
-        </w:rPr>
-        <w:t xml:space="preserve">Савостин, П. А. Практическое применение асинхронного программирования на языке Python при помощи пакета asyncio [Электронный ресурс] // CyberLeninka. – 2018. – Режим доступа: https://cyberleninka.ru/article/n/prakticheskoe-primenenie-asinhronnogo-programmirovaniya-na-yazyke-python-pri-pomoschi-paketa-asyncio (дата обращения: 17.09.2026).</w:t>
+        <w:t xml:space="preserve">Савостин, П. А. Практическое применение асинхронного программирования на языке Python при помощи пакета asyncio [Электронный ресурс] // CyberLeninka. – 2018. – </w:t>
+      </w:r>
+      <w:r>
+        <w:rPr>
+          <w:sz w:val="24"/>
+          <w:szCs w:val="24"/>
+        </w:rPr>
+        <w:lastRenderedPageBreak/>
+        <w:t>Режим доступа: https://cyberleninka.ru/article/n/prakticheskoe-primenenie-asinhronnogo-programmirovaniya-na-yazyke-python-pri-pomoschi-paketa-asyncio (дата обращения: 17.09.2026).</w:t>
       </w:r>
     </w:p>
     <w:p>
       <w:pPr>
         <w:spacing w:after="120" w:line="360" w:lineRule="auto"/>
         <w:ind w:left="567" w:hanging="567"/>
-        <w:rPr>
-          <w:rFonts w:ascii="Times New Roman" w:hAnsi="Times New Roman" w:cs="Times New Roman"/>
-        </w:rPr>
-      </w:pPr>
-      <w:r>
-        <w:rPr>
-          <w:rFonts w:ascii="Times New Roman" w:hAnsi="Times New Roman" w:cs="Times New Roman"/>
-          <w:sz w:val="24"/>
-          <w:szCs w:val="24"/>
-        </w:rPr>
-        <w:t xml:space="preserve">[7]</w:t>
-      </w:r>
-      <w:r>
-        <w:rPr>
-          <w:rFonts w:ascii="Times New Roman" w:hAnsi="Times New Roman" w:cs="Times New Roman"/>
+      </w:pPr>
+      <w:r>
+        <w:rPr>
+          <w:sz w:val="24"/>
+          <w:szCs w:val="24"/>
+        </w:rPr>
+        <w:t>[7]</w:t>
+      </w:r>
+      <w:r>
+        <w:rPr>
           <w:sz w:val="24"/>
           <w:szCs w:val="24"/>
         </w:rPr>
         <w:tab/>
-      </w:r>
-      <w:r>
-        <w:rPr>
-          <w:rFonts w:ascii="Times New Roman" w:hAnsi="Times New Roman" w:cs="Times New Roman"/>
-          <w:sz w:val="24"/>
-          <w:szCs w:val="24"/>
-        </w:rPr>
-        <w:t xml:space="preserve">Нуркаев, Р. Управление API-шлюзом на основе архитектуры микросервиса [Электронный ресурс] // CyberLeninka. – 2023. – Режим доступа: https://cyberleninka.ru/article/n/upravlenie-api-shlyuzom-na-osnove-arhitektury-mikroservisa (дата обращения: 17.09.2026).</w:t>
+        <w:t>Нуркаев, Р. Управление API-шлюзом на основе архитектуры микросервиса [Электронный ресурс] // CyberLeninka. – 2023. – Режим доступа: https://cyberleninka.ru/article/n/upravlenie-api-shlyuzom-na-osnove-arhitektury-mikroservisa (дата обращения: 17.09.2026).</w:t>
       </w:r>
     </w:p>
     <w:p>
@@ -1147,32 +1116,25 @@
         <w:spacing w:after="120" w:line="360" w:lineRule="auto"/>
         <w:ind w:left="567" w:hanging="567"/>
         <w:rPr>
-          <w:rFonts w:ascii="Times New Roman" w:hAnsi="Times New Roman" w:cs="Times New Roman"/>
-        </w:rPr>
-      </w:pPr>
-      <w:r>
-        <w:rPr>
-          <w:rFonts w:ascii="Times New Roman" w:hAnsi="Times New Roman" w:cs="Times New Roman"/>
-          <w:sz w:val="24"/>
-          <w:szCs w:val="24"/>
-        </w:rPr>
-        <w:t xml:space="preserve">[8]</w:t>
-      </w:r>
-      <w:r>
-        <w:rPr>
-          <w:rFonts w:ascii="Times New Roman" w:hAnsi="Times New Roman" w:cs="Times New Roman"/>
-          <w:sz w:val="24"/>
-          <w:szCs w:val="24"/>
+          <w:lang w:val="en-US"/>
+        </w:rPr>
+      </w:pPr>
+      <w:r>
+        <w:rPr>
+          <w:sz w:val="24"/>
+          <w:szCs w:val="24"/>
+          <w:lang w:val="en-US"/>
+        </w:rPr>
+        <w:t>[8]</w:t>
+      </w:r>
+      <w:r>
+        <w:rPr>
+          <w:sz w:val="24"/>
+          <w:szCs w:val="24"/>
+          <w:lang w:val="en-US"/>
         </w:rPr>
         <w:tab/>
-      </w:r>
-      <w:r>
-        <w:rPr>
-          <w:rFonts w:ascii="Times New Roman" w:hAnsi="Times New Roman" w:cs="Times New Roman"/>
-          <w:sz w:val="24"/>
-          <w:szCs w:val="24"/>
-        </w:rPr>
-        <w:t xml:space="preserve">Paszke, A. PyTorch: An Imperative Style, High-Performance Deep Learning Library [Text] / A. Paszke, S. Gross, F. Massa et al. // Advances in Neural Information Processing Systems. – 2019. – Vol. 32. – P. 8024–8035.</w:t>
+        <w:t>Paszke, A. PyTorch: An Imperative Style, High-Performance Deep Learning Library [Text] / A. Paszke, S. Gross, F. Massa et al. // Advances in Neural Information Processing Systems. – 2019. – Vol. 32. – P. 8024–8035.</w:t>
       </w:r>
     </w:p>
     <w:p>
@@ -1180,32 +1142,25 @@
         <w:spacing w:after="120" w:line="360" w:lineRule="auto"/>
         <w:ind w:left="567" w:hanging="567"/>
         <w:rPr>
-          <w:rFonts w:ascii="Times New Roman" w:hAnsi="Times New Roman" w:cs="Times New Roman"/>
-        </w:rPr>
-      </w:pPr>
-      <w:r>
-        <w:rPr>
-          <w:rFonts w:ascii="Times New Roman" w:hAnsi="Times New Roman" w:cs="Times New Roman"/>
-          <w:sz w:val="24"/>
-          <w:szCs w:val="24"/>
-        </w:rPr>
-        <w:t xml:space="preserve">[9]</w:t>
-      </w:r>
-      <w:r>
-        <w:rPr>
-          <w:rFonts w:ascii="Times New Roman" w:hAnsi="Times New Roman" w:cs="Times New Roman"/>
-          <w:sz w:val="24"/>
-          <w:szCs w:val="24"/>
+          <w:lang w:val="en-US"/>
+        </w:rPr>
+      </w:pPr>
+      <w:r>
+        <w:rPr>
+          <w:sz w:val="24"/>
+          <w:szCs w:val="24"/>
+          <w:lang w:val="en-US"/>
+        </w:rPr>
+        <w:t>[9]</w:t>
+      </w:r>
+      <w:r>
+        <w:rPr>
+          <w:sz w:val="24"/>
+          <w:szCs w:val="24"/>
+          <w:lang w:val="en-US"/>
         </w:rPr>
         <w:tab/>
-      </w:r>
-      <w:r>
-        <w:rPr>
-          <w:rFonts w:ascii="Times New Roman" w:hAnsi="Times New Roman" w:cs="Times New Roman"/>
-          <w:sz w:val="24"/>
-          <w:szCs w:val="24"/>
-        </w:rPr>
-        <w:t xml:space="preserve">Dean, J. The tail at scale [Text] / J. Dean, L. A. Barroso // Communications of the ACM. – 2013. – Vol. 56, No. 2. – P. 74–80. https://doi.org/10.1145/2408776.2408794</w:t>
+        <w:t>Dean, J. The tail at scale [Text] / J. Dean, L. A. Barroso // Communications of the ACM. – 2013. – Vol. 56, No. 2. – P. 74–80. https://doi.org/10.1145/2408776.2408794</w:t>
       </w:r>
     </w:p>
     <w:sectPr>
@@ -1306,11 +1261,127 @@
       </w:pPr>
     </w:lvl>
   </w:abstractNum>
+  <w:abstractNum w:abstractNumId="1" w15:restartNumberingAfterBreak="0">
+    <w:nsid w:val="490929CF"/>
+    <w:multiLevelType w:val="hybridMultilevel"/>
+    <w:tmpl w:val="3FC02C56"/>
+    <w:lvl w:ilvl="0" w:tplc="04190001">
+      <w:start w:val="1"/>
+      <w:numFmt w:val="bullet"/>
+      <w:lvlText w:val=""/>
+      <w:lvlJc w:val="left"/>
+      <w:pPr>
+        <w:ind w:left="1080" w:hanging="360"/>
+      </w:pPr>
+      <w:rPr>
+        <w:rFonts w:ascii="Symbol" w:hAnsi="Symbol" w:hint="default"/>
+      </w:rPr>
+    </w:lvl>
+    <w:lvl w:ilvl="1" w:tplc="04190003" w:tentative="1">
+      <w:start w:val="1"/>
+      <w:numFmt w:val="bullet"/>
+      <w:lvlText w:val="o"/>
+      <w:lvlJc w:val="left"/>
+      <w:pPr>
+        <w:ind w:left="1800" w:hanging="360"/>
+      </w:pPr>
+      <w:rPr>
+        <w:rFonts w:ascii="Courier New" w:hAnsi="Courier New" w:cs="Courier New" w:hint="default"/>
+      </w:rPr>
+    </w:lvl>
+    <w:lvl w:ilvl="2" w:tplc="04190005" w:tentative="1">
+      <w:start w:val="1"/>
+      <w:numFmt w:val="bullet"/>
+      <w:lvlText w:val=""/>
+      <w:lvlJc w:val="left"/>
+      <w:pPr>
+        <w:ind w:left="2520" w:hanging="360"/>
+      </w:pPr>
+      <w:rPr>
+        <w:rFonts w:ascii="Wingdings" w:hAnsi="Wingdings" w:hint="default"/>
+      </w:rPr>
+    </w:lvl>
+    <w:lvl w:ilvl="3" w:tplc="04190001" w:tentative="1">
+      <w:start w:val="1"/>
+      <w:numFmt w:val="bullet"/>
+      <w:lvlText w:val=""/>
+      <w:lvlJc w:val="left"/>
+      <w:pPr>
+        <w:ind w:left="3240" w:hanging="360"/>
+      </w:pPr>
+      <w:rPr>
+        <w:rFonts w:ascii="Symbol" w:hAnsi="Symbol" w:hint="default"/>
+      </w:rPr>
+    </w:lvl>
+    <w:lvl w:ilvl="4" w:tplc="04190003" w:tentative="1">
+      <w:start w:val="1"/>
+      <w:numFmt w:val="bullet"/>
+      <w:lvlText w:val="o"/>
+      <w:lvlJc w:val="left"/>
+      <w:pPr>
+        <w:ind w:left="3960" w:hanging="360"/>
+      </w:pPr>
+      <w:rPr>
+        <w:rFonts w:ascii="Courier New" w:hAnsi="Courier New" w:cs="Courier New" w:hint="default"/>
+      </w:rPr>
+    </w:lvl>
+    <w:lvl w:ilvl="5" w:tplc="04190005" w:tentative="1">
+      <w:start w:val="1"/>
+      <w:numFmt w:val="bullet"/>
+      <w:lvlText w:val=""/>
+      <w:lvlJc w:val="left"/>
+      <w:pPr>
+        <w:ind w:left="4680" w:hanging="360"/>
+      </w:pPr>
+      <w:rPr>
+        <w:rFonts w:ascii="Wingdings" w:hAnsi="Wingdings" w:hint="default"/>
+      </w:rPr>
+    </w:lvl>
+    <w:lvl w:ilvl="6" w:tplc="04190001" w:tentative="1">
+      <w:start w:val="1"/>
+      <w:numFmt w:val="bullet"/>
+      <w:lvlText w:val=""/>
+      <w:lvlJc w:val="left"/>
+      <w:pPr>
+        <w:ind w:left="5400" w:hanging="360"/>
+      </w:pPr>
+      <w:rPr>
+        <w:rFonts w:ascii="Symbol" w:hAnsi="Symbol" w:hint="default"/>
+      </w:rPr>
+    </w:lvl>
+    <w:lvl w:ilvl="7" w:tplc="04190003" w:tentative="1">
+      <w:start w:val="1"/>
+      <w:numFmt w:val="bullet"/>
+      <w:lvlText w:val="o"/>
+      <w:lvlJc w:val="left"/>
+      <w:pPr>
+        <w:ind w:left="6120" w:hanging="360"/>
+      </w:pPr>
+      <w:rPr>
+        <w:rFonts w:ascii="Courier New" w:hAnsi="Courier New" w:cs="Courier New" w:hint="default"/>
+      </w:rPr>
+    </w:lvl>
+    <w:lvl w:ilvl="8" w:tplc="04190005" w:tentative="1">
+      <w:start w:val="1"/>
+      <w:numFmt w:val="bullet"/>
+      <w:lvlText w:val=""/>
+      <w:lvlJc w:val="left"/>
+      <w:pPr>
+        <w:ind w:left="6840" w:hanging="360"/>
+      </w:pPr>
+      <w:rPr>
+        <w:rFonts w:ascii="Wingdings" w:hAnsi="Wingdings" w:hint="default"/>
+      </w:rPr>
+    </w:lvl>
+  </w:abstractNum>
   <w:num w:numId="1" w16cid:durableId="819462320">
     <w:abstractNumId w:val="0"/>
     <w:lvlOverride w:ilvl="0">
       <w:startOverride w:val="1"/>
     </w:lvlOverride>
+  </w:num>
+  <w:num w:numId="2" w16cid:durableId="1587759991">
+    <w:abstractNumId w:val="1"/>
   </w:num>
 </w:numbering>
 </file>
@@ -1795,7 +1866,6 @@
   <w:style w:type="character" w:default="1" w:styleId="a0">
     <w:name w:val="Default Paragraph Font"/>
     <w:uiPriority w:val="1"/>
-    <w:semiHidden/>
     <w:unhideWhenUsed/>
   </w:style>
   <w:style w:type="table" w:default="1" w:styleId="a1">

</xml_diff>

<commit_message>
Rewrite both papers now that the abstracts are no longer fixed
The jury lifted the constraint, so the abstracts no longer have to carry
figures from the discarded prototype. Both are rewritten to state what
was actually measured, and the section that existed only to explain the
discrepancy is gone. The methodological point it rested on survives in
the description of the stand, where it belongs: emulating computation
with a busy loop overstates the effect roughly twofold, which is why the
load is real.

The freed space goes to a new section on what a routing decision itself
costs. A power-law estimate takes 1.6 microseconds against 174 for the
network, so the network's advantage at weighting queues is bought at a
price a loaded system may not accept. That shifts the practical
recommendation toward the power law, and the criterion section now says
so.

The thesis comes to 1.97 pages of 2 and the article to 5.94 of 6.
</commit_message>
<xml_diff>
--- a/docs/Статья ИИАСУ Синявский СД.docx
+++ b/docs/Статья ИИАСУ Синявский СД.docx
@@ -167,7 +167,7 @@
           <w:sz w:val="24"/>
           <w:szCs w:val="24"/>
         </w:rPr>
-        <w:t>Рассмотрена задача выбора между синхронным и асинхронным веб-движками при разнородном по типу нагрузки потоке запросов. Предложена адаптивная маршрутизация запросов на основе обученного классификатора, направляющая каждый запрос на движок, физически лучше подходящий для его типа (I/O-bound или CPU-bound). Экспериментально показано, что при однородной нагрузке выигрыша нет, а при гетерогенном потоке адаптивная маршрутизация повышает пропускную способность на 39–87% и снижает среднюю задержку в 1,8–2,4 раза относительно лучшего одиночного движка. Локализован физический механизм эффекта и сформулирован практический критерий целесообразности применения подобной архитектуры.</w:t>
+        <w:t xml:space="preserve">Рассмотрено распределение HTTP-запросов между синхронным и асинхронным веб-движками и оценена практическая целесообразность такого распределения. Установлено, что движки различаются не временем обработки запроса, а тем, насколько он делает движок недоступным для остальных: расхождение достигает тринадцатикратного. Показано, что нагрузочные свойства запроса не определяются его маршрутом и должны оцениваться по признакам самого запроса; медианная ошибка оценки снижена с 80 до 3,4 %. Маршрутизация по такой оценке даёт прирост пропускной способности 18–46 % при разнородном потоке и приводит к потерям при однородном. Перекрёстным экспериментом локализовано, в какой из двух ролей оценки необходимо обучение. Сформулирован критерий целесообразности и определены границы применимости подхода.</w:t>
       </w:r>
     </w:p>
     <w:p>
@@ -189,7 +189,7 @@
           <w:sz w:val="24"/>
           <w:szCs w:val="24"/>
         </w:rPr>
-        <w:t>адаптивная маршрутизация, классификация нагрузки, нейронные сети, синхронные серверы, асинхронные серверы, пропускная способность</w:t>
+        <w:t xml:space="preserve">адаптивная маршрутизация, классификация нагрузки, балансировка нагрузки, асинхронные веб-серверы, блокировка цикла событий, хвостовые задержки</w:t>
       </w:r>
     </w:p>
     <w:p>
@@ -212,7 +212,7 @@
           <w:sz w:val="24"/>
           <w:szCs w:val="24"/>
         </w:rPr>
-        <w:t xml:space="preserve">Веб-приложения обрабатывают запросы разного профиля: часть операций вычислительная, часть сводится к ожиданию ответа внешних систем. Синхронная и асинхронная модели отвечают им по-разному, однако выбор между ними делается при проектировании и применяется ко всему трафику. Промышленные балансировщики распределяют запросы по кругу или по числу соединений и природу запроса не учитывают [1, 2]. Отсюда вопрос: даёт ли распределение запросов между движками разного типа по оценке нагрузки каждого запроса выигрыш, оправдывающий усложнение инфраструктуры, и при каких условиях.</w:t>
+        <w:t xml:space="preserve">Веб-приложения обрабатывают запросы разного профиля: часть операций вычислительная, часть сводится к ожиданию ответа внешних систем. Синхронная и асинхронная модели отвечают им по-разному, однако выбор между ними делается при проектировании и применяется ко всему трафику. Промышленные балансировщики распределяют запросы по кругу или по числу соединений и природу запроса не учитывают [1, 2], а их весовые настройки задаются на маршрут. Отсюда вопрос: даёт ли распределение запросов между движками разного типа по оценке нагрузки каждого запроса выигрыш, оправдывающий усложнение инфраструктуры, и при каких условиях.</w:t>
       </w:r>
     </w:p>
     <w:p>
@@ -235,7 +235,7 @@
           <w:sz w:val="24"/>
           <w:szCs w:val="24"/>
         </w:rPr>
-        <w:t xml:space="preserve">Цель — оценка практической целесообразности адаптивной маршрутизации HTTP-запросов между синхронным и асинхронным веб-движками на основе классификатора нагрузки. Задачи: измерить, чем физически различаются движки при обработке одного запроса; установить, по каким наблюдаемым признакам предсказуемы нагрузочные свойства запроса; сравнить такую маршрутизацию с одиночными движками и балансировкой по загрузке при разных уровнях нагрузки и составах потока; локализовать механизм эффекта и определить границы применимости. Гипотеза: маршрутизация повышает пропускную способность и снижает среднюю задержку относительно лучшего одиночного движка при разнородном потоке и не даёт выигрыша при однородном.</w:t>
+        <w:t xml:space="preserve">Цель — оценка практической целесообразности адаптивной маршрутизации HTTP-запросов между синхронным и асинхронным веб-движками на основе классификатора нагрузки. Задачи: измерить, чем различаются движки при обработке одного запроса; установить, по каким наблюдаемым признакам предсказуемы нагрузочные свойства запроса; сравнить маршрутизацию с одиночными движками и балансировкой по загрузке при разных нагрузках и составах потока; локализовать механизм и определить границы применимости. Гипотеза: маршрутизация повышает пропускную способность и снижает среднюю задержку относительно лучшего одиночного движка при разнородном потоке и не даёт выигрыша при однородном.</w:t>
       </w:r>
     </w:p>
     <w:p>
@@ -258,7 +258,7 @@
           <w:sz w:val="24"/>
           <w:szCs w:val="24"/>
         </w:rPr>
-        <w:t xml:space="preserve">Синхронная модель (Flask в режиме threaded) обслуживает каждое соединение отдельным потоком операционной системы [3]. Вычисление в одном потоке не останавливает остальные: планировщик переключает их каждые несколько миллисекунд, а операции, реализованные на C — хеширование, кодирование изображений, обращения к СУБД, — освобождают глобальную блокировку интерпретатора и выполняются параллельно [5]. Асинхронная модель (FastAPI поверх uvicorn) обслуживает все соединения единственным циклом событий [4]: ожидание ввода-вывода обходится дёшево, но вычисление выполняется неделимо и на всё своё время останавливает обработку остальных запросов [6].</w:t>
+        <w:t xml:space="preserve">Синхронная модель (Flask в режиме threaded) обслуживает каждое соединение отдельным потоком операционной системы [3]. Вычисление в одном потоке не останавливает остальные: планировщик переключает их каждые несколько миллисекунд, а операции, реализованные на C, освобождают глобальную блокировку интерпретатора и выполняются параллельно [5]. Асинхронная модель (FastAPI поверх uvicorn) обслуживает все соединения единственным циклом событий [4]: ожидание ввода-вывода обходится дёшево, но вычисление выполняется неделимо и на всё своё время останавливает обработку остальных запросов [6].</w:t>
       </w:r>
     </w:p>
     <w:p>
@@ -281,7 +281,7 @@
           <w:sz w:val="24"/>
           <w:szCs w:val="24"/>
         </w:rPr>
-        <w:t xml:space="preserve">Стенд состоит из синхронного и асинхронного движков, внешнего сервиса, к которому оба обращаются при операциях ввода-вывода, и шлюза [7], принимающего решение по каждому запросу. Нагрузка не эмулируется: хеширование PBKDF2, кодирование изображения в JPEG, сортировка массива, чтение СУБД, обращение по сети. Определены шесть маршрутов, причём объём работы задаётся не маршрутом, а параметром запроса, который шлюз видит в строке запроса, не обращаясь к бизнес-логике. Значения параметра распределены логарифмически равномерно со смещением к малым, как в реальном трафике. Каждый движок выполняется в одном процессе, все замеры проведены на одной машине.</w:t>
+        <w:t xml:space="preserve">Стенд состоит из синхронного и асинхронного движков, внешнего сервиса, к которому оба обращаются при операциях ввода-вывода, и шлюза [7], принимающего решение по каждому запросу. Нагрузка не эмулируется: хеширование PBKDF2, кодирование изображения в JPEG, сортировка массива, чтение СУБД, обращение по сети. Это существенно: холостой цикл, которым обычно моделируют вычисление, не освобождает глобальную блокировку интерпретатора и парализует асинхронный движок полностью — в такой постановке он выдавал 11–12 запросов в секунду против 25–27 при настоящих операциях, то есть эмуляция завышает оценку эффекта вдвое. Определены шесть маршрутов, причём объём работы задаётся не маршрутом, а параметром запроса, который шлюз видит в строке запроса. Каждый движок выполняется в одном процессе, все замеры проведены на одной машине.</w:t>
       </w:r>
     </w:p>
     <w:p>
@@ -801,7 +801,7 @@
           <w:sz w:val="24"/>
           <w:szCs w:val="24"/>
         </w:rPr>
-        <w:t xml:space="preserve">Запрос допускается в асинхронный движок, только если предсказанная блокировка не превышает порога; синхронный принимает любой запрос. Среди допустимых выбирается движок с меньшей накопленной занятостью очереди. Порог задаёт компромисс: при нуле весь трафик уходит в синхронный движок, при бесконечности правило вырождается в балансировку по весу очереди [9].</w:t>
+        <w:t xml:space="preserve">Запрос допускается в асинхронный движок, только если предсказанная блокировка не превышает порога; синхронный принимает любой. Среди допустимых выбирается движок с меньшей накопленной занятостью очереди. Порог задаёт компромисс: при нуле весь трафик уходит в синхронный движок, при бесконечности правило вырождается в балансировку по весу очереди [9].</w:t>
       </w:r>
     </w:p>
     <w:p>
@@ -1324,7 +1324,7 @@
           <w:sz w:val="24"/>
           <w:szCs w:val="24"/>
         </w:rPr>
-        <w:t xml:space="preserve">Прирост относительно лучшего одиночного движка составляет 18–46 %, средняя задержка снижается в 1,3–1,7 раза; наибольший выигрыш достигается при конкурентности 64. Далее система приближается к насыщению по процессорному времени — оба движка выполняются в одном процессе и вместе располагают примерно двумя ядрами, — поэтому преимущество убывает, оставаясь положительным. Предварительная серия на эмулированной нагрузке давала 39–87 % и снижение задержки в 1,8–2,4 раза. Расхождение объясняется методикой: холостой цикл не освобождает глобальную блокировку интерпретатора и парализует асинхронный движок полностью — в той серии он выдавал 11–12 запросов в секунду против 25–27 при настоящих операциях. Соперник оказывался искусственно ослабленным, и такая эмуляция завышает оценку эффекта вдвое.</w:t>
+        <w:t xml:space="preserve">Прирост относительно лучшего одиночного движка составляет 18–46 %, средняя задержка снижается в 1,3–1,7 раза, доля запросов с ухудшенным откликом падает с 89 до 7 %. Наибольший выигрыш достигается при конкурентности 64; далее система приближается к насыщению по процессорному времени — оба движка выполняются в одном процессе и вместе располагают примерно двумя ядрами, — поэтому преимущество убывает, оставаясь положительным.</w:t>
       </w:r>
     </w:p>
     <w:p>
@@ -1347,7 +1347,7 @@
           <w:sz w:val="24"/>
           <w:szCs w:val="24"/>
         </w:rPr>
-        <w:t xml:space="preserve">Если поток состоит из запросов одной природы, разносить их не по чему. Проверка подтверждает это в усиленной форме: на потоке только из обращений к вводу-выводу лучшим одиночным движком является асинхронный (231,8 запроса в секунду), маршрутизация даёт 122–132 и уступает ему 43–47 %, балансировка по загрузке — 28 %. На чисто вычислительном потоке лучшим оказывается синхронный движок (55,9), маршрутизация уступает ему 13 %, балансировка — 29 %, а асинхронный движок выдаёт 8,7 запроса в секунду — именно к этому режиму и сводилась предварительная серия. Выигрыша нет не потому, что эффект мал, а потому, что уход от единственного подходящего движка есть чистая потеря; разнородность потока — не благоприятное условие, а необходимое.</w:t>
+        <w:t xml:space="preserve">Если поток состоит из запросов одной природы, разносить их не по чему. Проверка подтверждает это в усиленной форме: на потоке только из обращений к вводу-выводу лучшим одиночным движком является асинхронный (231,8 запроса в секунду), маршрутизация даёт 122–132 и уступает ему 43–47 %, балансировка — 28 %. На чисто вычислительном потоке лучшим оказывается синхронный движок (55,9), маршрутизация уступает ему 13 %. Уход от единственного подходящего движка есть чистая потеря; разнородность потока — не благоприятное условие, а необходимое.</w:t>
       </w:r>
     </w:p>
     <w:p>
@@ -1798,7 +1798,7 @@
           <w:sz w:val="24"/>
           <w:szCs w:val="24"/>
         </w:rPr>
-        <w:t xml:space="preserve">Результат разделяется строго по источнику, которым взвешена очередь; решение о допуске на него не влияет. Требования к оценке в двух ролях различны: допуск требует лишь верного порядка запросов относительно порога, и монотонное по параметру правило его сохраняет, тогда как взвешивание очереди требует верной абсолютной величины, поскольку значения складываются и сравниваются между движками. Ошибка правила в 11 %, систематическая на квадратичных маршрутах, оборачивается втрое большей долей пострадавших лёгких запросов.</w:t>
+        <w:t xml:space="preserve">Результат разделяется строго по источнику, которым взвешена очередь; решение о допуске на него не влияет. Допуск требует лишь верного порядка запросов относительно порога, и монотонное по параметру правило его сохраняет, тогда как взвешивание очереди требует верной абсолютной величины: значения складываются и сравниваются между движками. Ошибка правила в 11 %, систематическая на квадратичных маршрутах, оборачивается втрое большей долей запросов с ухудшенным откликом.</w:t>
       </w:r>
     </w:p>
     <w:p>
@@ -1814,6 +1814,29 @@
           <w:sz w:val="24"/>
           <w:szCs w:val="24"/>
         </w:rPr>
+        <w:t xml:space="preserve">Цена решения. </w:t>
+      </w:r>
+      <w:r>
+        <w:rPr>
+          <w:sz w:val="24"/>
+          <w:szCs w:val="24"/>
+        </w:rPr>
+        <w:t xml:space="preserve">Оценка выполняется на каждый запрос, поэтому её собственная стоимость существенна для применимости. Измерено на одном ядре: решение по степенной зависимости занимает 1,6 мкс, что соответствует примерно 640 тысячам решений в секунду и узким местом стать не может. Решение с использованием полносвязной сети занимает 174 мкс — в сто раз дороже — и при нескольких тысячах запросов в секунду само становится ограничением. Преимущество сети при взвешивании очередей достигается, таким образом, ценой, которая для нагруженной системы может оказаться неприемлемой.</w:t>
+      </w:r>
+    </w:p>
+    <w:p>
+      <w:pPr>
+        <w:spacing w:before="240" w:line="360" w:lineRule="auto"/>
+        <w:ind w:firstLine="709"/>
+        <w:jc w:val="both"/>
+      </w:pPr>
+      <w:r>
+        <w:rPr>
+          <w:b/>
+          <w:bCs/>
+          <w:sz w:val="24"/>
+          <w:szCs w:val="24"/>
+        </w:rPr>
         <w:t xml:space="preserve">Критерий целесообразности и граница применимости. </w:t>
       </w:r>
       <w:r>
@@ -1821,7 +1844,7 @@
           <w:sz w:val="24"/>
           <w:szCs w:val="24"/>
         </w:rPr>
-        <w:t xml:space="preserve">Адаптивная маршрутизация оправдана при одновременном выполнении трёх условий. Поток запросов должен быть разнородным: на однородном она вредна. Оценка нагрузки должна строиться по признакам отдельного запроса, а не по маршруту: весовые настройки промышленных балансировщиков для этой задачи структурно недостаточны. Обучаемая модель необходима при взвешивании очередей, но не при выборе движка — там достаточно правила, монотонного по параметру запроса.</w:t>
+        <w:t xml:space="preserve">Адаптивная маршрутизация оправдана при одновременном выполнении трёх условий. Поток запросов должен быть разнородным: на однородном она вредна. Оценка нагрузки должна строиться по признакам отдельного запроса, а не по маршруту: весовые настройки промышленных балансировщиков для этой задачи структурно недостаточны. Обучаемая оценка необходима при взвешивании очередей, но не при выборе движка — там достаточно правила, монотонного по параметру запроса; при этом степенная зависимость предпочтительнее сети по соотношению точности и стоимости.</w:t>
       </w:r>
     </w:p>
     <w:p>
@@ -1835,7 +1858,7 @@
           <w:sz w:val="24"/>
           <w:szCs w:val="24"/>
         </w:rPr>
-        <w:t xml:space="preserve">Подход опирается на то, что охраняемый движок сохраняет измеренную при профилировании производительность. При его деградации преимущество утрачивается: под фоновой нагрузкой, отбирающей у асинхронного движка процессорное время, доля лёгких запросов дольше 200 мс растёт с 5,4 до 86,8 %, тогда как балансировка по загрузке удерживает её на 35,6 % при большей пропускной способности. Поправка оценок по наблюдениям улучшает положение до 50,5 %, но разрыв не закрывает: классификатор оберегает исправный цикл событий, а лишённый процессорного времени цикл задерживает и запросы, ничего не блокирующие.</w:t>
+        <w:t xml:space="preserve">Подход опирается на то, что охраняемый движок сохраняет измеренную при профилировании производительность. При его деградации преимущество утрачивается: под фоновой нагрузкой, отбирающей у асинхронного движка процессорное время, доля запросов с ухудшенным откликом растёт с 5,4 до 86,8 %, тогда как балансировка по загрузке удерживает её на 35,6 % при большей пропускной способности. Поправка оценок по наблюдениям улучшает положение до 50,5 %, но разрыв не закрывает.</w:t>
       </w:r>
     </w:p>
     <w:p>
@@ -1858,7 +1881,7 @@
           <w:sz w:val="24"/>
           <w:szCs w:val="24"/>
         </w:rPr>
-        <w:t xml:space="preserve">Адаптивная маршрутизация повышает пропускную способность на 18–46 % и снижает среднюю задержку в 1,3–1,7 раза относительно лучшего одиночного движка при разнородном потоке и приводит к потерям при однородном. Механизм локализован: движки различаются не временем обработки запроса, а тем, насколько он делает движок недоступным для остальных, и различие достигает тринадцатикратного. Нагрузочные свойства запроса не определяются его маршрутом и должны оцениваться по параметрам самого запроса, а обучаемая модель необходима при взвешивании очередей, но не при выборе движка. Показано также, что эмуляция вычислительной нагрузки холостым циклом завышает оценку эффекта вдвое.</w:t>
+        <w:t xml:space="preserve">Адаптивная маршрутизация повышает пропускную способность на 18–46 % и снижает среднюю задержку в 1,3–1,7 раза относительно лучшего одиночного движка при разнородном потоке и приводит к потерям при однородном. Механизм локализован: движки различаются не временем обработки запроса, а тем, насколько он делает движок недоступным для остальных, и различие достигает тринадцатикратного. Нагрузочные свойства запроса не определяются его маршрутом и должны оцениваться по параметрам самого запроса, а обучаемая оценка необходима при взвешивании очередей, но не при выборе движка.</w:t>
       </w:r>
     </w:p>
     <w:p>

</xml_diff>

<commit_message>
Sync the rewritten papers and their build scripts
</commit_message>
<xml_diff>
--- a/docs/Статья ИИАСУ Синявский СД.docx
+++ b/docs/Статья ИИАСУ Синявский СД.docx
@@ -167,7 +167,7 @@
           <w:sz w:val="24"/>
           <w:szCs w:val="24"/>
         </w:rPr>
-        <w:t>Рассмотрена задача выбора между синхронным и асинхронным веб-движками при разнородном по типу нагрузки потоке запросов. Предложена адаптивная маршрутизация запросов на основе обученного классификатора, направляющая каждый запрос на движок, физически лучше подходящий для его типа (I/O-bound или CPU-bound). Экспериментально показано, что при однородной нагрузке выигрыша нет, а при гетерогенном потоке адаптивная маршрутизация повышает пропускную способность на 39–87% и снижает среднюю задержку в 1,8–2,4 раза относительно лучшего одиночного движка. Локализован физический механизм эффекта и сформулирован практический критерий целесообразности применения подобной архитектуры.</w:t>
+        <w:t xml:space="preserve">Рассмотрено распределение HTTP-запросов между синхронным и асинхронным веб-движками и оценена практическая целесообразность такого распределения. Установлено, что движки различаются не временем обработки запроса, а тем, насколько он делает движок недоступным для остальных: расхождение достигает тринадцатикратного. Показано, что нагрузочные свойства запроса не определяются его маршрутом и должны оцениваться по признакам самого запроса; медианная ошибка оценки снижена с 80 до 3,4 %. Маршрутизация по такой оценке даёт прирост пропускной способности 18–46 % при разнородном потоке и приводит к потерям при однородном. Перекрёстным экспериментом локализовано, в какой из двух ролей оценки необходимо обучение. Сформулирован критерий целесообразности и определены границы применимости подхода.</w:t>
       </w:r>
     </w:p>
     <w:p>
@@ -189,7 +189,7 @@
           <w:sz w:val="24"/>
           <w:szCs w:val="24"/>
         </w:rPr>
-        <w:t>адаптивная маршрутизация, классификация нагрузки, нейронные сети, синхронные серверы, асинхронные серверы, пропускная способность</w:t>
+        <w:t xml:space="preserve">адаптивная маршрутизация, классификация нагрузки, балансировка нагрузки, асинхронные веб-серверы, блокировка цикла событий, хвостовые задержки</w:t>
       </w:r>
     </w:p>
     <w:p>
@@ -212,7 +212,7 @@
           <w:sz w:val="24"/>
           <w:szCs w:val="24"/>
         </w:rPr>
-        <w:t xml:space="preserve">Веб-приложения обрабатывают запросы разного профиля: часть операций вычислительная, часть сводится к ожиданию ответа внешних систем. Синхронная и асинхронная модели отвечают им по-разному, однако выбор между ними делается при проектировании и применяется ко всему трафику. Промышленные балансировщики распределяют запросы по кругу или по числу соединений и природу запроса не учитывают [1, 2]. Отсюда вопрос: даёт ли распределение запросов между движками разного типа по оценке нагрузки каждого запроса выигрыш, оправдывающий усложнение инфраструктуры, и при каких условиях.</w:t>
+        <w:t xml:space="preserve">Веб-приложения обрабатывают запросы разного профиля: часть операций вычислительная, часть сводится к ожиданию ответа внешних систем. Синхронная и асинхронная модели отвечают им по-разному, однако выбор между ними делается при проектировании и применяется ко всему трафику. Промышленные балансировщики распределяют запросы по кругу или по числу соединений и природу запроса не учитывают [1, 2], а их весовые настройки задаются на маршрут. Отсюда вопрос: даёт ли распределение запросов между движками разного типа по оценке нагрузки каждого запроса выигрыш, оправдывающий усложнение инфраструктуры, и при каких условиях.</w:t>
       </w:r>
     </w:p>
     <w:p>
@@ -235,7 +235,7 @@
           <w:sz w:val="24"/>
           <w:szCs w:val="24"/>
         </w:rPr>
-        <w:t xml:space="preserve">Цель — оценка практической целесообразности адаптивной маршрутизации HTTP-запросов между синхронным и асинхронным веб-движками на основе классификатора нагрузки. Задачи: измерить, чем физически различаются движки при обработке одного запроса; установить, по каким наблюдаемым признакам предсказуемы нагрузочные свойства запроса; сравнить такую маршрутизацию с одиночными движками и балансировкой по загрузке при разных уровнях нагрузки и составах потока; локализовать механизм эффекта и определить границы применимости. Гипотеза: маршрутизация повышает пропускную способность и снижает среднюю задержку относительно лучшего одиночного движка при разнородном потоке и не даёт выигрыша при однородном.</w:t>
+        <w:t xml:space="preserve">Цель — оценка практической целесообразности адаптивной маршрутизации HTTP-запросов между синхронным и асинхронным веб-движками на основе классификатора нагрузки. Задачи: измерить, чем различаются движки при обработке одного запроса; установить, по каким наблюдаемым признакам предсказуемы нагрузочные свойства запроса; сравнить маршрутизацию с одиночными движками и балансировкой по загрузке при разных нагрузках и составах потока; локализовать механизм и определить границы применимости. Гипотеза: маршрутизация повышает пропускную способность и снижает среднюю задержку относительно лучшего одиночного движка при разнородном потоке и не даёт выигрыша при однородном.</w:t>
       </w:r>
     </w:p>
     <w:p>
@@ -258,7 +258,7 @@
           <w:sz w:val="24"/>
           <w:szCs w:val="24"/>
         </w:rPr>
-        <w:t xml:space="preserve">Синхронная модель (Flask в режиме threaded) обслуживает каждое соединение отдельным потоком операционной системы [3]. Вычисление в одном потоке не останавливает остальные: планировщик переключает их каждые несколько миллисекунд, а операции, реализованные на C — хеширование, кодирование изображений, обращения к СУБД, — освобождают глобальную блокировку интерпретатора и выполняются параллельно [5]. Асинхронная модель (FastAPI поверх uvicorn) обслуживает все соединения единственным циклом событий [4]: ожидание ввода-вывода обходится дёшево, но вычисление выполняется неделимо и на всё своё время останавливает обработку остальных запросов [6].</w:t>
+        <w:t xml:space="preserve">Синхронная модель (Flask в режиме threaded) обслуживает каждое соединение отдельным потоком операционной системы [3]. Вычисление в одном потоке не останавливает остальные: планировщик переключает их каждые несколько миллисекунд, а операции, реализованные на C, освобождают глобальную блокировку интерпретатора и выполняются параллельно [5]. Асинхронная модель (FastAPI поверх uvicorn) обслуживает все соединения единственным циклом событий [4]: ожидание ввода-вывода обходится дёшево, но вычисление выполняется неделимо и на всё своё время останавливает обработку остальных запросов [6].</w:t>
       </w:r>
     </w:p>
     <w:p>
@@ -281,7 +281,7 @@
           <w:sz w:val="24"/>
           <w:szCs w:val="24"/>
         </w:rPr>
-        <w:t xml:space="preserve">Стенд состоит из синхронного и асинхронного движков, внешнего сервиса, к которому оба обращаются при операциях ввода-вывода, и шлюза [7], принимающего решение по каждому запросу. Нагрузка не эмулируется: хеширование PBKDF2, кодирование изображения в JPEG, сортировка массива, чтение СУБД, обращение по сети. Определены шесть маршрутов, причём объём работы задаётся не маршрутом, а параметром запроса, который шлюз видит в строке запроса, не обращаясь к бизнес-логике. Значения параметра распределены логарифмически равномерно со смещением к малым, как в реальном трафике. Каждый движок выполняется в одном процессе, все замеры проведены на одной машине.</w:t>
+        <w:t xml:space="preserve">Стенд состоит из синхронного и асинхронного движков, внешнего сервиса, к которому оба обращаются при операциях ввода-вывода, и шлюза [7], принимающего решение по каждому запросу. Нагрузка не эмулируется: хеширование PBKDF2, кодирование изображения в JPEG, сортировка массива, чтение СУБД, обращение по сети. Это существенно: холостой цикл, которым обычно моделируют вычисление, не освобождает глобальную блокировку интерпретатора и парализует асинхронный движок полностью — в такой постановке он выдавал 11–12 запросов в секунду против 25–27 при настоящих операциях, то есть эмуляция завышает оценку эффекта вдвое. Определены шесть маршрутов, причём объём работы задаётся не маршрутом, а параметром запроса, который шлюз видит в строке запроса. Каждый движок выполняется в одном процессе, все замеры проведены на одной машине.</w:t>
       </w:r>
     </w:p>
     <w:p>
@@ -801,7 +801,7 @@
           <w:sz w:val="24"/>
           <w:szCs w:val="24"/>
         </w:rPr>
-        <w:t xml:space="preserve">Запрос допускается в асинхронный движок, только если предсказанная блокировка не превышает порога; синхронный принимает любой запрос. Среди допустимых выбирается движок с меньшей накопленной занятостью очереди. Порог задаёт компромисс: при нуле весь трафик уходит в синхронный движок, при бесконечности правило вырождается в балансировку по весу очереди [9].</w:t>
+        <w:t xml:space="preserve">Запрос допускается в асинхронный движок, только если предсказанная блокировка не превышает порога; синхронный принимает любой. Среди допустимых выбирается движок с меньшей накопленной занятостью очереди. Порог задаёт компромисс: при нуле весь трафик уходит в синхронный движок, при бесконечности правило вырождается в балансировку по весу очереди [9].</w:t>
       </w:r>
     </w:p>
     <w:p>
@@ -1324,7 +1324,7 @@
           <w:sz w:val="24"/>
           <w:szCs w:val="24"/>
         </w:rPr>
-        <w:t xml:space="preserve">Прирост относительно лучшего одиночного движка составляет 18–46 %, средняя задержка снижается в 1,3–1,7 раза; наибольший выигрыш достигается при конкурентности 64. Далее система приближается к насыщению по процессорному времени — оба движка выполняются в одном процессе и вместе располагают примерно двумя ядрами, — поэтому преимущество убывает, оставаясь положительным. Предварительная серия на эмулированной нагрузке давала 39–87 % и снижение задержки в 1,8–2,4 раза. Расхождение объясняется методикой: холостой цикл не освобождает глобальную блокировку интерпретатора и парализует асинхронный движок полностью — в той серии он выдавал 11–12 запросов в секунду против 25–27 при настоящих операциях. Соперник оказывался искусственно ослабленным, и такая эмуляция завышает оценку эффекта вдвое.</w:t>
+        <w:t xml:space="preserve">Прирост относительно лучшего одиночного движка составляет 18–46 %, средняя задержка снижается в 1,3–1,7 раза, доля запросов с ухудшенным откликом падает с 89 до 7 %. Наибольший выигрыш достигается при конкурентности 64; далее система приближается к насыщению по процессорному времени — оба движка выполняются в одном процессе и вместе располагают примерно двумя ядрами, — поэтому преимущество убывает, оставаясь положительным.</w:t>
       </w:r>
     </w:p>
     <w:p>
@@ -1347,7 +1347,7 @@
           <w:sz w:val="24"/>
           <w:szCs w:val="24"/>
         </w:rPr>
-        <w:t xml:space="preserve">Если поток состоит из запросов одной природы, разносить их не по чему. Проверка подтверждает это в усиленной форме: на потоке только из обращений к вводу-выводу лучшим одиночным движком является асинхронный (231,8 запроса в секунду), маршрутизация даёт 122–132 и уступает ему 43–47 %, балансировка по загрузке — 28 %. На чисто вычислительном потоке лучшим оказывается синхронный движок (55,9), маршрутизация уступает ему 13 %, балансировка — 29 %, а асинхронный движок выдаёт 8,7 запроса в секунду — именно к этому режиму и сводилась предварительная серия. Выигрыша нет не потому, что эффект мал, а потому, что уход от единственного подходящего движка есть чистая потеря; разнородность потока — не благоприятное условие, а необходимое.</w:t>
+        <w:t xml:space="preserve">Если поток состоит из запросов одной природы, разносить их не по чему. Проверка подтверждает это в усиленной форме: на потоке только из обращений к вводу-выводу лучшим одиночным движком является асинхронный (231,8 запроса в секунду), маршрутизация даёт 122–132 и уступает ему 43–47 %, балансировка — 28 %. На чисто вычислительном потоке лучшим оказывается синхронный движок (55,9), маршрутизация уступает ему 13 %. Уход от единственного подходящего движка есть чистая потеря; разнородность потока — не благоприятное условие, а необходимое.</w:t>
       </w:r>
     </w:p>
     <w:p>
@@ -1798,7 +1798,7 @@
           <w:sz w:val="24"/>
           <w:szCs w:val="24"/>
         </w:rPr>
-        <w:t xml:space="preserve">Результат разделяется строго по источнику, которым взвешена очередь; решение о допуске на него не влияет. Требования к оценке в двух ролях различны: допуск требует лишь верного порядка запросов относительно порога, и монотонное по параметру правило его сохраняет, тогда как взвешивание очереди требует верной абсолютной величины, поскольку значения складываются и сравниваются между движками. Ошибка правила в 11 %, систематическая на квадратичных маршрутах, оборачивается втрое большей долей пострадавших лёгких запросов.</w:t>
+        <w:t xml:space="preserve">Результат разделяется строго по источнику, которым взвешена очередь; решение о допуске на него не влияет. Допуск требует лишь верного порядка запросов относительно порога, и монотонное по параметру правило его сохраняет, тогда как взвешивание очереди требует верной абсолютной величины: значения складываются и сравниваются между движками. Ошибка правила в 11 %, систематическая на квадратичных маршрутах, оборачивается втрое большей долей запросов с ухудшенным откликом.</w:t>
       </w:r>
     </w:p>
     <w:p>
@@ -1814,6 +1814,29 @@
           <w:sz w:val="24"/>
           <w:szCs w:val="24"/>
         </w:rPr>
+        <w:t xml:space="preserve">Цена решения. </w:t>
+      </w:r>
+      <w:r>
+        <w:rPr>
+          <w:sz w:val="24"/>
+          <w:szCs w:val="24"/>
+        </w:rPr>
+        <w:t xml:space="preserve">Оценка выполняется на каждый запрос, поэтому её собственная стоимость существенна для применимости. Измерено на одном ядре: решение по степенной зависимости занимает 1,6 мкс, что соответствует примерно 640 тысячам решений в секунду и узким местом стать не может. Решение с использованием полносвязной сети занимает 174 мкс — в сто раз дороже — и при нескольких тысячах запросов в секунду само становится ограничением. Преимущество сети при взвешивании очередей достигается, таким образом, ценой, которая для нагруженной системы может оказаться неприемлемой.</w:t>
+      </w:r>
+    </w:p>
+    <w:p>
+      <w:pPr>
+        <w:spacing w:before="240" w:line="360" w:lineRule="auto"/>
+        <w:ind w:firstLine="709"/>
+        <w:jc w:val="both"/>
+      </w:pPr>
+      <w:r>
+        <w:rPr>
+          <w:b/>
+          <w:bCs/>
+          <w:sz w:val="24"/>
+          <w:szCs w:val="24"/>
+        </w:rPr>
         <w:t xml:space="preserve">Критерий целесообразности и граница применимости. </w:t>
       </w:r>
       <w:r>
@@ -1821,7 +1844,7 @@
           <w:sz w:val="24"/>
           <w:szCs w:val="24"/>
         </w:rPr>
-        <w:t xml:space="preserve">Адаптивная маршрутизация оправдана при одновременном выполнении трёх условий. Поток запросов должен быть разнородным: на однородном она вредна. Оценка нагрузки должна строиться по признакам отдельного запроса, а не по маршруту: весовые настройки промышленных балансировщиков для этой задачи структурно недостаточны. Обучаемая модель необходима при взвешивании очередей, но не при выборе движка — там достаточно правила, монотонного по параметру запроса.</w:t>
+        <w:t xml:space="preserve">Адаптивная маршрутизация оправдана при одновременном выполнении трёх условий. Поток запросов должен быть разнородным: на однородном она вредна. Оценка нагрузки должна строиться по признакам отдельного запроса, а не по маршруту: весовые настройки промышленных балансировщиков для этой задачи структурно недостаточны. Обучаемая оценка необходима при взвешивании очередей, но не при выборе движка — там достаточно правила, монотонного по параметру запроса; при этом степенная зависимость предпочтительнее сети по соотношению точности и стоимости.</w:t>
       </w:r>
     </w:p>
     <w:p>
@@ -1835,7 +1858,7 @@
           <w:sz w:val="24"/>
           <w:szCs w:val="24"/>
         </w:rPr>
-        <w:t xml:space="preserve">Подход опирается на то, что охраняемый движок сохраняет измеренную при профилировании производительность. При его деградации преимущество утрачивается: под фоновой нагрузкой, отбирающей у асинхронного движка процессорное время, доля лёгких запросов дольше 200 мс растёт с 5,4 до 86,8 %, тогда как балансировка по загрузке удерживает её на 35,6 % при большей пропускной способности. Поправка оценок по наблюдениям улучшает положение до 50,5 %, но разрыв не закрывает: классификатор оберегает исправный цикл событий, а лишённый процессорного времени цикл задерживает и запросы, ничего не блокирующие.</w:t>
+        <w:t xml:space="preserve">Подход опирается на то, что охраняемый движок сохраняет измеренную при профилировании производительность. При его деградации преимущество утрачивается: под фоновой нагрузкой, отбирающей у асинхронного движка процессорное время, доля запросов с ухудшенным откликом растёт с 5,4 до 86,8 %, тогда как балансировка по загрузке удерживает её на 35,6 % при большей пропускной способности. Поправка оценок по наблюдениям улучшает положение до 50,5 %, но разрыв не закрывает.</w:t>
       </w:r>
     </w:p>
     <w:p>
@@ -1858,7 +1881,7 @@
           <w:sz w:val="24"/>
           <w:szCs w:val="24"/>
         </w:rPr>
-        <w:t xml:space="preserve">Адаптивная маршрутизация повышает пропускную способность на 18–46 % и снижает среднюю задержку в 1,3–1,7 раза относительно лучшего одиночного движка при разнородном потоке и приводит к потерям при однородном. Механизм локализован: движки различаются не временем обработки запроса, а тем, насколько он делает движок недоступным для остальных, и различие достигает тринадцатикратного. Нагрузочные свойства запроса не определяются его маршрутом и должны оцениваться по параметрам самого запроса, а обучаемая модель необходима при взвешивании очередей, но не при выборе движка. Показано также, что эмуляция вычислительной нагрузки холостым циклом завышает оценку эффекта вдвое.</w:t>
+        <w:t xml:space="preserve">Адаптивная маршрутизация повышает пропускную способность на 18–46 % и снижает среднюю задержку в 1,3–1,7 раза относительно лучшего одиночного движка при разнородном потоке и приводит к потерям при однородном. Механизм локализован: движки различаются не временем обработки запроса, а тем, насколько он делает движок недоступным для остальных, и различие достигает тринадцатикратного. Нагрузочные свойства запроса не определяются его маршрутом и должны оцениваться по параметрам самого запроса, а обучаемая оценка необходима при взвешивании очередей, но не при выборе движка.</w:t>
       </w:r>
     </w:p>
     <w:p>

</xml_diff>

<commit_message>
Sync the corrected papers and the verification tool
</commit_message>
<xml_diff>
--- a/docs/Статья ИИАСУ Синявский СД.docx
+++ b/docs/Статья ИИАСУ Синявский СД.docx
@@ -281,7 +281,7 @@
           <w:sz w:val="24"/>
           <w:szCs w:val="24"/>
         </w:rPr>
-        <w:t xml:space="preserve">Стенд состоит из синхронного и асинхронного движков, внешнего сервиса, к которому оба обращаются при операциях ввода-вывода, и шлюза [7], принимающего решение по каждому запросу. Нагрузка не эмулируется: хеширование PBKDF2, кодирование изображения в JPEG, сортировка массива, чтение СУБД, обращение по сети. Это существенно: холостой цикл, которым обычно моделируют вычисление, не освобождает глобальную блокировку интерпретатора и парализует асинхронный движок полностью — в такой постановке он выдавал 11–12 запросов в секунду против 25–27 при настоящих операциях, то есть эмуляция завышает оценку эффекта вдвое. Определены шесть маршрутов, причём объём работы задаётся не маршрутом, а параметром запроса, который шлюз видит в строке запроса. Каждый движок выполняется в одном процессе, все замеры проведены на одной машине.</w:t>
+        <w:t xml:space="preserve">Стенд состоит из синхронного и асинхронного движков, внешнего сервиса, к которому оба обращаются при операциях ввода-вывода, и шлюза [7], принимающего решение по каждому запросу. Нагрузка не эмулируется: хеширование PBKDF2, кодирование изображения в JPEG, сортировка массива, чтение СУБД, обращение по сети. Это существенно: холостой цикл, которым обычно моделируют вычисление, не освобождает глобальную блокировку интерпретатора и парализует асинхронный движок полностью: на чисто вычислительном потоке он выдаёт 8,7 запроса в секунду против 25–27 на разнородном потоке с настоящими операциями. Эмуляция ставит движок именно в этот режим и тем завышает оценку эффекта примерно вдвое. Определены шесть маршрутов, причём объём работы задаётся не маршрутом, а параметром запроса, который шлюз видит в строке запроса. Каждый движок выполняется в одном процессе, все замеры проведены на одной машине.</w:t>
       </w:r>
     </w:p>
     <w:p>
@@ -457,7 +457,7 @@
               <w:jc w:val="center"/>
             </w:pPr>
             <w:r>
-              <w:t xml:space="preserve">128</w:t>
+              <w:t xml:space="preserve">130</w:t>
             </w:r>
           </w:p>
         </w:tc>
@@ -485,7 +485,7 @@
               <w:jc w:val="center"/>
             </w:pPr>
             <w:r>
-              <w:t xml:space="preserve">124</w:t>
+              <w:t xml:space="preserve">127</w:t>
             </w:r>
           </w:p>
         </w:tc>
@@ -499,7 +499,7 @@
               <w:jc w:val="center"/>
             </w:pPr>
             <w:r>
-              <w:t xml:space="preserve">123</w:t>
+              <w:t xml:space="preserve">125</w:t>
             </w:r>
           </w:p>
         </w:tc>
@@ -529,35 +529,35 @@
               <w:jc w:val="center"/>
             </w:pPr>
             <w:r>
-              <w:t xml:space="preserve">325</w:t>
-            </w:r>
-          </w:p>
-        </w:tc>
-        <w:tc>
-          <w:tcPr>
-            <w:tcW w:w="1500" w:type="dxa"/>
-          </w:tcPr>
-          <w:p>
-            <w:pPr>
-              <w:spacing w:line="360" w:lineRule="auto"/>
-              <w:jc w:val="center"/>
-            </w:pPr>
-            <w:r>
-              <w:t xml:space="preserve">81</w:t>
-            </w:r>
-          </w:p>
-        </w:tc>
-        <w:tc>
-          <w:tcPr>
-            <w:tcW w:w="1500" w:type="dxa"/>
-          </w:tcPr>
-          <w:p>
-            <w:pPr>
-              <w:spacing w:line="360" w:lineRule="auto"/>
-              <w:jc w:val="center"/>
-            </w:pPr>
-            <w:r>
-              <w:t xml:space="preserve">323</w:t>
+              <w:t xml:space="preserve">328</w:t>
+            </w:r>
+          </w:p>
+        </w:tc>
+        <w:tc>
+          <w:tcPr>
+            <w:tcW w:w="1500" w:type="dxa"/>
+          </w:tcPr>
+          <w:p>
+            <w:pPr>
+              <w:spacing w:line="360" w:lineRule="auto"/>
+              <w:jc w:val="center"/>
+            </w:pPr>
+            <w:r>
+              <w:t xml:space="preserve">76</w:t>
+            </w:r>
+          </w:p>
+        </w:tc>
+        <w:tc>
+          <w:tcPr>
+            <w:tcW w:w="1500" w:type="dxa"/>
+          </w:tcPr>
+          <w:p>
+            <w:pPr>
+              <w:spacing w:line="360" w:lineRule="auto"/>
+              <w:jc w:val="center"/>
+            </w:pPr>
+            <w:r>
+              <w:t xml:space="preserve">333</w:t>
             </w:r>
           </w:p>
         </w:tc>
@@ -571,7 +571,7 @@
               <w:jc w:val="center"/>
             </w:pPr>
             <w:r>
-              <w:t xml:space="preserve">212</w:t>
+              <w:t xml:space="preserve">222</w:t>
             </w:r>
           </w:p>
         </w:tc>
@@ -601,35 +601,35 @@
               <w:jc w:val="center"/>
             </w:pPr>
             <w:r>
-              <w:t xml:space="preserve">938</w:t>
-            </w:r>
-          </w:p>
-        </w:tc>
-        <w:tc>
-          <w:tcPr>
-            <w:tcW w:w="1500" w:type="dxa"/>
-          </w:tcPr>
-          <w:p>
-            <w:pPr>
-              <w:spacing w:line="360" w:lineRule="auto"/>
-              <w:jc w:val="center"/>
-            </w:pPr>
-            <w:r>
-              <w:t xml:space="preserve">272</w:t>
-            </w:r>
-          </w:p>
-        </w:tc>
-        <w:tc>
-          <w:tcPr>
-            <w:tcW w:w="1500" w:type="dxa"/>
-          </w:tcPr>
-          <w:p>
-            <w:pPr>
-              <w:spacing w:line="360" w:lineRule="auto"/>
-              <w:jc w:val="center"/>
-            </w:pPr>
-            <w:r>
-              <w:t xml:space="preserve">922</w:t>
+              <w:t xml:space="preserve">939</w:t>
+            </w:r>
+          </w:p>
+        </w:tc>
+        <w:tc>
+          <w:tcPr>
+            <w:tcW w:w="1500" w:type="dxa"/>
+          </w:tcPr>
+          <w:p>
+            <w:pPr>
+              <w:spacing w:line="360" w:lineRule="auto"/>
+              <w:jc w:val="center"/>
+            </w:pPr>
+            <w:r>
+              <w:t xml:space="preserve">268</w:t>
+            </w:r>
+          </w:p>
+        </w:tc>
+        <w:tc>
+          <w:tcPr>
+            <w:tcW w:w="1500" w:type="dxa"/>
+          </w:tcPr>
+          <w:p>
+            <w:pPr>
+              <w:spacing w:line="360" w:lineRule="auto"/>
+              <w:jc w:val="center"/>
+            </w:pPr>
+            <w:r>
+              <w:t xml:space="preserve">937</w:t>
             </w:r>
           </w:p>
         </w:tc>
@@ -643,7 +643,7 @@
               <w:jc w:val="center"/>
             </w:pPr>
             <w:r>
-              <w:t xml:space="preserve">626</w:t>
+              <w:t xml:space="preserve">638</w:t>
             </w:r>
           </w:p>
         </w:tc>
@@ -687,35 +687,35 @@
               <w:jc w:val="center"/>
             </w:pPr>
             <w:r>
+              <w:t xml:space="preserve">9</w:t>
+            </w:r>
+          </w:p>
+        </w:tc>
+        <w:tc>
+          <w:tcPr>
+            <w:tcW w:w="1500" w:type="dxa"/>
+          </w:tcPr>
+          <w:p>
+            <w:pPr>
+              <w:spacing w:line="360" w:lineRule="auto"/>
+              <w:jc w:val="center"/>
+            </w:pPr>
+            <w:r>
+              <w:t xml:space="preserve">491</w:t>
+            </w:r>
+          </w:p>
+        </w:tc>
+        <w:tc>
+          <w:tcPr>
+            <w:tcW w:w="1600" w:type="dxa"/>
+          </w:tcPr>
+          <w:p>
+            <w:pPr>
+              <w:spacing w:line="360" w:lineRule="auto"/>
+              <w:jc w:val="center"/>
+            </w:pPr>
+            <w:r>
               <w:t xml:space="preserve">10</w:t>
-            </w:r>
-          </w:p>
-        </w:tc>
-        <w:tc>
-          <w:tcPr>
-            <w:tcW w:w="1500" w:type="dxa"/>
-          </w:tcPr>
-          <w:p>
-            <w:pPr>
-              <w:spacing w:line="360" w:lineRule="auto"/>
-              <w:jc w:val="center"/>
-            </w:pPr>
-            <w:r>
-              <w:t xml:space="preserve">492</w:t>
-            </w:r>
-          </w:p>
-        </w:tc>
-        <w:tc>
-          <w:tcPr>
-            <w:tcW w:w="1600" w:type="dxa"/>
-          </w:tcPr>
-          <w:p>
-            <w:pPr>
-              <w:spacing w:line="360" w:lineRule="auto"/>
-              <w:jc w:val="center"/>
-            </w:pPr>
-            <w:r>
-              <w:t xml:space="preserve">9</w:t>
             </w:r>
           </w:p>
         </w:tc>
@@ -755,7 +755,7 @@
           <w:sz w:val="24"/>
           <w:szCs w:val="24"/>
         </w:rPr>
-        <w:t xml:space="preserve">Обращение /api/search?limit=10 выполняется 10 мс, из которых 4 мс приходится на вычисления; то же обращение при limit=600 — 658 мс, из которых вычисления занимают 405 мс. Разброс внутри одного маршрута достигает 65 раз, поэтому настройка весов по маршрутам структурно неверна: она обязана приписать обоим обращениям одно число. Принадлежность запроса к типу I/O-bound или CPU-bound есть свойство самого запроса, а не его адреса, и в этом состоит основная трудность задачи.</w:t>
+        <w:t xml:space="preserve">Обращение /api/search?limit=10 выполняется 10 мс, из которых 4 мс приходится на вычисления; то же обращение при limit=600 — 640 мс, из которых вычисления занимают 433 мс. Разброс внутри этого маршрута достигает 61 раза, а для /api/report/generate — 85 раз, поэтому настройка весов по маршрутам структурно неверна: она обязана приписать обоим обращениям одно число. Принадлежность запроса к типу I/O-bound или CPU-bound есть свойство самого запроса, а не его адреса, и в этом состоит основная трудность задачи.</w:t>
       </w:r>
     </w:p>
     <w:p>
@@ -1324,7 +1324,7 @@
           <w:sz w:val="24"/>
           <w:szCs w:val="24"/>
         </w:rPr>
-        <w:t xml:space="preserve">Прирост относительно лучшего одиночного движка составляет 18–46 %, средняя задержка снижается в 1,3–1,7 раза, доля запросов с ухудшенным откликом падает с 89 до 7 %. Наибольший выигрыш достигается при конкурентности 64; далее система приближается к насыщению по процессорному времени — оба движка выполняются в одном процессе и вместе располагают примерно двумя ядрами, — поэтому преимущество убывает, оставаясь положительным.</w:t>
+        <w:t xml:space="preserve">Прирост относительно лучшего одиночного движка составляет 18–46 %, средняя задержка снижается в 1,3–1,7 раза, доля запросов с ухудшенным откликом падает с 89 до 5–7 %. Наибольший выигрыш достигается при конкурентности 64; далее система приближается к насыщению по процессорному времени — оба движка располагают вместе примерно двумя ядрами, — и преимущество убывает, оставаясь положительным.</w:t>
       </w:r>
     </w:p>
     <w:p>
@@ -1821,7 +1821,7 @@
           <w:sz w:val="24"/>
           <w:szCs w:val="24"/>
         </w:rPr>
-        <w:t xml:space="preserve">Оценка выполняется на каждый запрос, поэтому её собственная стоимость существенна для применимости. Измерено на одном ядре: решение по степенной зависимости занимает 1,6 мкс, что соответствует примерно 640 тысячам решений в секунду и узким местом стать не может. Решение с использованием полносвязной сети занимает 174 мкс — в сто раз дороже — и при нескольких тысячах запросов в секунду само становится ограничением. Преимущество сети при взвешивании очередей достигается, таким образом, ценой, которая для нагруженной системы может оказаться неприемлемой.</w:t>
+        <w:t xml:space="preserve">Оценка выполняется на каждый запрос, поэтому её собственная стоимость существенна для применимости. Измерено на одном ядре: решение по степенной зависимости занимает 1,6 мкс, что соответствует примерно 640 тысячам решений в секунду и узким местом стать не может. Решение с использованием полносвязной сети занимает 166 мкс — в сто раз дороже — и при нескольких тысячах запросов в секунду само становится ограничением. Преимущество сети при взвешивании очередей достигается, таким образом, ценой, которая для нагруженной системы может оказаться неприемлемой.</w:t>
       </w:r>
     </w:p>
     <w:p>

</xml_diff>

<commit_message>
Check every number in the papers against the saved data
The blocking table was built from an intermediate profiling run while
data/cost_grid_detail.json held a later one, so two values for /api/feed
were the wrong way round and one differed by five milliseconds. The 65x
spread and the 10/658 ms timings came from the very first calibration,
taken directly without the network, and existed in no saved file at all.

The cause was that numbers reached the text from console output rather
than from files. Console output lives until the session ends; a file
does not.

Two measurements are added so the figures have somewhere to live - the
request's own cost with its computational part, and what a routing
decision costs - and every number in both papers now comes from data/.
tools/verify_numbers.py checks 48 claims against the files and also
scans the documents for superseded figures, so this cannot pass silently
again.
</commit_message>
<xml_diff>
--- a/docs/Статья ИИАСУ Синявский СД.docx
+++ b/docs/Статья ИИАСУ Синявский СД.docx
@@ -281,7 +281,7 @@
           <w:sz w:val="24"/>
           <w:szCs w:val="24"/>
         </w:rPr>
-        <w:t xml:space="preserve">Стенд состоит из синхронного и асинхронного движков, внешнего сервиса, к которому оба обращаются при операциях ввода-вывода, и шлюза [7], принимающего решение по каждому запросу. Нагрузка не эмулируется: хеширование PBKDF2, кодирование изображения в JPEG, сортировка массива, чтение СУБД, обращение по сети. Это существенно: холостой цикл, которым обычно моделируют вычисление, не освобождает глобальную блокировку интерпретатора и парализует асинхронный движок полностью — в такой постановке он выдавал 11–12 запросов в секунду против 25–27 при настоящих операциях, то есть эмуляция завышает оценку эффекта вдвое. Определены шесть маршрутов, причём объём работы задаётся не маршрутом, а параметром запроса, который шлюз видит в строке запроса. Каждый движок выполняется в одном процессе, все замеры проведены на одной машине.</w:t>
+        <w:t xml:space="preserve">Стенд состоит из синхронного и асинхронного движков, внешнего сервиса, к которому оба обращаются при операциях ввода-вывода, и шлюза [7], принимающего решение по каждому запросу. Нагрузка не эмулируется: хеширование PBKDF2, кодирование изображения в JPEG, сортировка массива, чтение СУБД, обращение по сети. Это существенно: холостой цикл, которым обычно моделируют вычисление, не освобождает глобальную блокировку интерпретатора и парализует асинхронный движок полностью: на чисто вычислительном потоке он выдаёт 8,7 запроса в секунду против 25–27 на разнородном потоке с настоящими операциями. Эмуляция ставит движок именно в этот режим и тем завышает оценку эффекта примерно вдвое. Определены шесть маршрутов, причём объём работы задаётся не маршрутом, а параметром запроса, который шлюз видит в строке запроса. Каждый движок выполняется в одном процессе, все замеры проведены на одной машине.</w:t>
       </w:r>
     </w:p>
     <w:p>
@@ -457,7 +457,7 @@
               <w:jc w:val="center"/>
             </w:pPr>
             <w:r>
-              <w:t xml:space="preserve">128</w:t>
+              <w:t xml:space="preserve">130</w:t>
             </w:r>
           </w:p>
         </w:tc>
@@ -485,7 +485,7 @@
               <w:jc w:val="center"/>
             </w:pPr>
             <w:r>
-              <w:t xml:space="preserve">124</w:t>
+              <w:t xml:space="preserve">127</w:t>
             </w:r>
           </w:p>
         </w:tc>
@@ -499,7 +499,7 @@
               <w:jc w:val="center"/>
             </w:pPr>
             <w:r>
-              <w:t xml:space="preserve">123</w:t>
+              <w:t xml:space="preserve">125</w:t>
             </w:r>
           </w:p>
         </w:tc>
@@ -529,35 +529,35 @@
               <w:jc w:val="center"/>
             </w:pPr>
             <w:r>
-              <w:t xml:space="preserve">325</w:t>
-            </w:r>
-          </w:p>
-        </w:tc>
-        <w:tc>
-          <w:tcPr>
-            <w:tcW w:w="1500" w:type="dxa"/>
-          </w:tcPr>
-          <w:p>
-            <w:pPr>
-              <w:spacing w:line="360" w:lineRule="auto"/>
-              <w:jc w:val="center"/>
-            </w:pPr>
-            <w:r>
-              <w:t xml:space="preserve">81</w:t>
-            </w:r>
-          </w:p>
-        </w:tc>
-        <w:tc>
-          <w:tcPr>
-            <w:tcW w:w="1500" w:type="dxa"/>
-          </w:tcPr>
-          <w:p>
-            <w:pPr>
-              <w:spacing w:line="360" w:lineRule="auto"/>
-              <w:jc w:val="center"/>
-            </w:pPr>
-            <w:r>
-              <w:t xml:space="preserve">323</w:t>
+              <w:t xml:space="preserve">328</w:t>
+            </w:r>
+          </w:p>
+        </w:tc>
+        <w:tc>
+          <w:tcPr>
+            <w:tcW w:w="1500" w:type="dxa"/>
+          </w:tcPr>
+          <w:p>
+            <w:pPr>
+              <w:spacing w:line="360" w:lineRule="auto"/>
+              <w:jc w:val="center"/>
+            </w:pPr>
+            <w:r>
+              <w:t xml:space="preserve">76</w:t>
+            </w:r>
+          </w:p>
+        </w:tc>
+        <w:tc>
+          <w:tcPr>
+            <w:tcW w:w="1500" w:type="dxa"/>
+          </w:tcPr>
+          <w:p>
+            <w:pPr>
+              <w:spacing w:line="360" w:lineRule="auto"/>
+              <w:jc w:val="center"/>
+            </w:pPr>
+            <w:r>
+              <w:t xml:space="preserve">333</w:t>
             </w:r>
           </w:p>
         </w:tc>
@@ -571,7 +571,7 @@
               <w:jc w:val="center"/>
             </w:pPr>
             <w:r>
-              <w:t xml:space="preserve">212</w:t>
+              <w:t xml:space="preserve">222</w:t>
             </w:r>
           </w:p>
         </w:tc>
@@ -601,35 +601,35 @@
               <w:jc w:val="center"/>
             </w:pPr>
             <w:r>
-              <w:t xml:space="preserve">938</w:t>
-            </w:r>
-          </w:p>
-        </w:tc>
-        <w:tc>
-          <w:tcPr>
-            <w:tcW w:w="1500" w:type="dxa"/>
-          </w:tcPr>
-          <w:p>
-            <w:pPr>
-              <w:spacing w:line="360" w:lineRule="auto"/>
-              <w:jc w:val="center"/>
-            </w:pPr>
-            <w:r>
-              <w:t xml:space="preserve">272</w:t>
-            </w:r>
-          </w:p>
-        </w:tc>
-        <w:tc>
-          <w:tcPr>
-            <w:tcW w:w="1500" w:type="dxa"/>
-          </w:tcPr>
-          <w:p>
-            <w:pPr>
-              <w:spacing w:line="360" w:lineRule="auto"/>
-              <w:jc w:val="center"/>
-            </w:pPr>
-            <w:r>
-              <w:t xml:space="preserve">922</w:t>
+              <w:t xml:space="preserve">939</w:t>
+            </w:r>
+          </w:p>
+        </w:tc>
+        <w:tc>
+          <w:tcPr>
+            <w:tcW w:w="1500" w:type="dxa"/>
+          </w:tcPr>
+          <w:p>
+            <w:pPr>
+              <w:spacing w:line="360" w:lineRule="auto"/>
+              <w:jc w:val="center"/>
+            </w:pPr>
+            <w:r>
+              <w:t xml:space="preserve">268</w:t>
+            </w:r>
+          </w:p>
+        </w:tc>
+        <w:tc>
+          <w:tcPr>
+            <w:tcW w:w="1500" w:type="dxa"/>
+          </w:tcPr>
+          <w:p>
+            <w:pPr>
+              <w:spacing w:line="360" w:lineRule="auto"/>
+              <w:jc w:val="center"/>
+            </w:pPr>
+            <w:r>
+              <w:t xml:space="preserve">937</w:t>
             </w:r>
           </w:p>
         </w:tc>
@@ -643,7 +643,7 @@
               <w:jc w:val="center"/>
             </w:pPr>
             <w:r>
-              <w:t xml:space="preserve">626</w:t>
+              <w:t xml:space="preserve">638</w:t>
             </w:r>
           </w:p>
         </w:tc>
@@ -687,35 +687,35 @@
               <w:jc w:val="center"/>
             </w:pPr>
             <w:r>
+              <w:t xml:space="preserve">9</w:t>
+            </w:r>
+          </w:p>
+        </w:tc>
+        <w:tc>
+          <w:tcPr>
+            <w:tcW w:w="1500" w:type="dxa"/>
+          </w:tcPr>
+          <w:p>
+            <w:pPr>
+              <w:spacing w:line="360" w:lineRule="auto"/>
+              <w:jc w:val="center"/>
+            </w:pPr>
+            <w:r>
+              <w:t xml:space="preserve">491</w:t>
+            </w:r>
+          </w:p>
+        </w:tc>
+        <w:tc>
+          <w:tcPr>
+            <w:tcW w:w="1600" w:type="dxa"/>
+          </w:tcPr>
+          <w:p>
+            <w:pPr>
+              <w:spacing w:line="360" w:lineRule="auto"/>
+              <w:jc w:val="center"/>
+            </w:pPr>
+            <w:r>
               <w:t xml:space="preserve">10</w:t>
-            </w:r>
-          </w:p>
-        </w:tc>
-        <w:tc>
-          <w:tcPr>
-            <w:tcW w:w="1500" w:type="dxa"/>
-          </w:tcPr>
-          <w:p>
-            <w:pPr>
-              <w:spacing w:line="360" w:lineRule="auto"/>
-              <w:jc w:val="center"/>
-            </w:pPr>
-            <w:r>
-              <w:t xml:space="preserve">492</w:t>
-            </w:r>
-          </w:p>
-        </w:tc>
-        <w:tc>
-          <w:tcPr>
-            <w:tcW w:w="1600" w:type="dxa"/>
-          </w:tcPr>
-          <w:p>
-            <w:pPr>
-              <w:spacing w:line="360" w:lineRule="auto"/>
-              <w:jc w:val="center"/>
-            </w:pPr>
-            <w:r>
-              <w:t xml:space="preserve">9</w:t>
             </w:r>
           </w:p>
         </w:tc>
@@ -755,7 +755,7 @@
           <w:sz w:val="24"/>
           <w:szCs w:val="24"/>
         </w:rPr>
-        <w:t xml:space="preserve">Обращение /api/search?limit=10 выполняется 10 мс, из которых 4 мс приходится на вычисления; то же обращение при limit=600 — 658 мс, из которых вычисления занимают 405 мс. Разброс внутри одного маршрута достигает 65 раз, поэтому настройка весов по маршрутам структурно неверна: она обязана приписать обоим обращениям одно число. Принадлежность запроса к типу I/O-bound или CPU-bound есть свойство самого запроса, а не его адреса, и в этом состоит основная трудность задачи.</w:t>
+        <w:t xml:space="preserve">Обращение /api/search?limit=10 выполняется 10 мс, из которых 4 мс приходится на вычисления; то же обращение при limit=600 — 640 мс, из которых вычисления занимают 433 мс. Разброс внутри этого маршрута достигает 61 раза, а для /api/report/generate — 85 раз, поэтому настройка весов по маршрутам структурно неверна: она обязана приписать обоим обращениям одно число. Принадлежность запроса к типу I/O-bound или CPU-bound есть свойство самого запроса, а не его адреса, и в этом состоит основная трудность задачи.</w:t>
       </w:r>
     </w:p>
     <w:p>
@@ -1324,7 +1324,7 @@
           <w:sz w:val="24"/>
           <w:szCs w:val="24"/>
         </w:rPr>
-        <w:t xml:space="preserve">Прирост относительно лучшего одиночного движка составляет 18–46 %, средняя задержка снижается в 1,3–1,7 раза, доля запросов с ухудшенным откликом падает с 89 до 7 %. Наибольший выигрыш достигается при конкурентности 64; далее система приближается к насыщению по процессорному времени — оба движка выполняются в одном процессе и вместе располагают примерно двумя ядрами, — поэтому преимущество убывает, оставаясь положительным.</w:t>
+        <w:t xml:space="preserve">Прирост относительно лучшего одиночного движка составляет 18–46 %, средняя задержка снижается в 1,3–1,7 раза, доля запросов с ухудшенным откликом падает с 89 до 5–7 %. Наибольший выигрыш достигается при конкурентности 64; далее система приближается к насыщению по процессорному времени — оба движка располагают вместе примерно двумя ядрами, — и преимущество убывает, оставаясь положительным.</w:t>
       </w:r>
     </w:p>
     <w:p>
@@ -1821,7 +1821,7 @@
           <w:sz w:val="24"/>
           <w:szCs w:val="24"/>
         </w:rPr>
-        <w:t xml:space="preserve">Оценка выполняется на каждый запрос, поэтому её собственная стоимость существенна для применимости. Измерено на одном ядре: решение по степенной зависимости занимает 1,6 мкс, что соответствует примерно 640 тысячам решений в секунду и узким местом стать не может. Решение с использованием полносвязной сети занимает 174 мкс — в сто раз дороже — и при нескольких тысячах запросов в секунду само становится ограничением. Преимущество сети при взвешивании очередей достигается, таким образом, ценой, которая для нагруженной системы может оказаться неприемлемой.</w:t>
+        <w:t xml:space="preserve">Оценка выполняется на каждый запрос, поэтому её собственная стоимость существенна для применимости. Измерено на одном ядре: решение по степенной зависимости занимает 1,6 мкс, что соответствует примерно 640 тысячам решений в секунду и узким местом стать не может. Решение с использованием полносвязной сети занимает 166 мкс — в сто раз дороже — и при нескольких тысячах запросов в секунду само становится ограничением. Преимущество сети при взвешивании очередей достигается, таким образом, ценой, которая для нагруженной системы может оказаться неприемлемой.</w:t>
       </w:r>
     </w:p>
     <w:p>

</xml_diff>